<commit_message>
chore: update BA Uji Admin and Verlap templates with teks_persetujuan
</commit_message>
<xml_diff>
--- a/src/templates/uji-administrasi/template_ba_uji_admin.docx
+++ b/src/templates/uji-administrasi/template_ba_uji_admin.docx
@@ -174,7 +174,115 @@
                 <w:sz w:val="20"/>
                 <w:szCs w:val="20"/>
               </w:rPr>
-              <w:t>Jalan Ronggowarsito Nomor 18B, Sragen Wetan, Sragen, Jawa Tengah 57214</w:t>
+              <w:t xml:space="preserve">Jalan </w:t>
+            </w:r>
+            <w:proofErr w:type="spellStart"/>
+            <w:r>
+              <w:rPr>
+                <w:rFonts w:ascii="Arial Narrow" w:hAnsi="Arial Narrow" w:cs="Arial"/>
+                <w:sz w:val="20"/>
+                <w:szCs w:val="20"/>
+              </w:rPr>
+              <w:t>Ronggowarsito</w:t>
+            </w:r>
+            <w:proofErr w:type="spellEnd"/>
+            <w:r>
+              <w:rPr>
+                <w:rFonts w:ascii="Arial Narrow" w:hAnsi="Arial Narrow" w:cs="Arial"/>
+                <w:sz w:val="20"/>
+                <w:szCs w:val="20"/>
+              </w:rPr>
+              <w:t xml:space="preserve"> </w:t>
+            </w:r>
+            <w:proofErr w:type="spellStart"/>
+            <w:r>
+              <w:rPr>
+                <w:rFonts w:ascii="Arial Narrow" w:hAnsi="Arial Narrow" w:cs="Arial"/>
+                <w:sz w:val="20"/>
+                <w:szCs w:val="20"/>
+              </w:rPr>
+              <w:t>Nomor</w:t>
+            </w:r>
+            <w:proofErr w:type="spellEnd"/>
+            <w:r>
+              <w:rPr>
+                <w:rFonts w:ascii="Arial Narrow" w:hAnsi="Arial Narrow" w:cs="Arial"/>
+                <w:sz w:val="20"/>
+                <w:szCs w:val="20"/>
+              </w:rPr>
+              <w:t xml:space="preserve"> 18B, </w:t>
+            </w:r>
+            <w:proofErr w:type="spellStart"/>
+            <w:r>
+              <w:rPr>
+                <w:rFonts w:ascii="Arial Narrow" w:hAnsi="Arial Narrow" w:cs="Arial"/>
+                <w:sz w:val="20"/>
+                <w:szCs w:val="20"/>
+              </w:rPr>
+              <w:t>Sragen</w:t>
+            </w:r>
+            <w:proofErr w:type="spellEnd"/>
+            <w:r>
+              <w:rPr>
+                <w:rFonts w:ascii="Arial Narrow" w:hAnsi="Arial Narrow" w:cs="Arial"/>
+                <w:sz w:val="20"/>
+                <w:szCs w:val="20"/>
+              </w:rPr>
+              <w:t xml:space="preserve"> </w:t>
+            </w:r>
+            <w:proofErr w:type="spellStart"/>
+            <w:r>
+              <w:rPr>
+                <w:rFonts w:ascii="Arial Narrow" w:hAnsi="Arial Narrow" w:cs="Arial"/>
+                <w:sz w:val="20"/>
+                <w:szCs w:val="20"/>
+              </w:rPr>
+              <w:t>Wetan</w:t>
+            </w:r>
+            <w:proofErr w:type="spellEnd"/>
+            <w:r>
+              <w:rPr>
+                <w:rFonts w:ascii="Arial Narrow" w:hAnsi="Arial Narrow" w:cs="Arial"/>
+                <w:sz w:val="20"/>
+                <w:szCs w:val="20"/>
+              </w:rPr>
+              <w:t xml:space="preserve">, </w:t>
+            </w:r>
+            <w:proofErr w:type="spellStart"/>
+            <w:r>
+              <w:rPr>
+                <w:rFonts w:ascii="Arial Narrow" w:hAnsi="Arial Narrow" w:cs="Arial"/>
+                <w:sz w:val="20"/>
+                <w:szCs w:val="20"/>
+              </w:rPr>
+              <w:t>Sragen</w:t>
+            </w:r>
+            <w:proofErr w:type="spellEnd"/>
+            <w:r>
+              <w:rPr>
+                <w:rFonts w:ascii="Arial Narrow" w:hAnsi="Arial Narrow" w:cs="Arial"/>
+                <w:sz w:val="20"/>
+                <w:szCs w:val="20"/>
+              </w:rPr>
+              <w:t xml:space="preserve">, </w:t>
+            </w:r>
+            <w:proofErr w:type="spellStart"/>
+            <w:r>
+              <w:rPr>
+                <w:rFonts w:ascii="Arial Narrow" w:hAnsi="Arial Narrow" w:cs="Arial"/>
+                <w:sz w:val="20"/>
+                <w:szCs w:val="20"/>
+              </w:rPr>
+              <w:t>Jawa</w:t>
+            </w:r>
+            <w:proofErr w:type="spellEnd"/>
+            <w:r>
+              <w:rPr>
+                <w:rFonts w:ascii="Arial Narrow" w:hAnsi="Arial Narrow" w:cs="Arial"/>
+                <w:sz w:val="20"/>
+                <w:szCs w:val="20"/>
+              </w:rPr>
+              <w:t xml:space="preserve"> Tengah 57214</w:t>
             </w:r>
           </w:p>
           <w:p>
@@ -188,13 +296,77 @@
                 <w:szCs w:val="20"/>
               </w:rPr>
             </w:pPr>
+            <w:proofErr w:type="spellStart"/>
             <w:r>
               <w:rPr>
                 <w:rFonts w:ascii="Arial Narrow" w:hAnsi="Arial Narrow" w:cs="Arial"/>
                 <w:sz w:val="20"/>
                 <w:szCs w:val="20"/>
               </w:rPr>
-              <w:t>Telepon (0271) 891136, Faksimile (0271) 891136, Laman www.dlh.sragenkab.go.id, Pos-el dlh.sragenkab.go.id</w:t>
+              <w:t>Telepon</w:t>
+            </w:r>
+            <w:proofErr w:type="spellEnd"/>
+            <w:r>
+              <w:rPr>
+                <w:rFonts w:ascii="Arial Narrow" w:hAnsi="Arial Narrow" w:cs="Arial"/>
+                <w:sz w:val="20"/>
+                <w:szCs w:val="20"/>
+              </w:rPr>
+              <w:t xml:space="preserve"> (0271) 891136, </w:t>
+            </w:r>
+            <w:proofErr w:type="spellStart"/>
+            <w:r>
+              <w:rPr>
+                <w:rFonts w:ascii="Arial Narrow" w:hAnsi="Arial Narrow" w:cs="Arial"/>
+                <w:sz w:val="20"/>
+                <w:szCs w:val="20"/>
+              </w:rPr>
+              <w:t>Faksimile</w:t>
+            </w:r>
+            <w:proofErr w:type="spellEnd"/>
+            <w:r>
+              <w:rPr>
+                <w:rFonts w:ascii="Arial Narrow" w:hAnsi="Arial Narrow" w:cs="Arial"/>
+                <w:sz w:val="20"/>
+                <w:szCs w:val="20"/>
+              </w:rPr>
+              <w:t xml:space="preserve"> (0271) 891136, </w:t>
+            </w:r>
+            <w:proofErr w:type="spellStart"/>
+            <w:r>
+              <w:rPr>
+                <w:rFonts w:ascii="Arial Narrow" w:hAnsi="Arial Narrow" w:cs="Arial"/>
+                <w:sz w:val="20"/>
+                <w:szCs w:val="20"/>
+              </w:rPr>
+              <w:t>Laman</w:t>
+            </w:r>
+            <w:proofErr w:type="spellEnd"/>
+            <w:r>
+              <w:rPr>
+                <w:rFonts w:ascii="Arial Narrow" w:hAnsi="Arial Narrow" w:cs="Arial"/>
+                <w:sz w:val="20"/>
+                <w:szCs w:val="20"/>
+              </w:rPr>
+              <w:t xml:space="preserve"> www.dlh.sragenkab.go.id, Pos-</w:t>
+            </w:r>
+            <w:proofErr w:type="spellStart"/>
+            <w:r>
+              <w:rPr>
+                <w:rFonts w:ascii="Arial Narrow" w:hAnsi="Arial Narrow" w:cs="Arial"/>
+                <w:sz w:val="20"/>
+                <w:szCs w:val="20"/>
+              </w:rPr>
+              <w:t>el</w:t>
+            </w:r>
+            <w:proofErr w:type="spellEnd"/>
+            <w:r>
+              <w:rPr>
+                <w:rFonts w:ascii="Arial Narrow" w:hAnsi="Arial Narrow" w:cs="Arial"/>
+                <w:sz w:val="20"/>
+                <w:szCs w:val="20"/>
+              </w:rPr>
+              <w:t xml:space="preserve"> dlh.sragenkab.go.id</w:t>
             </w:r>
           </w:p>
         </w:tc>
@@ -283,16 +455,29 @@
           <w:sz w:val="24"/>
           <w:szCs w:val="24"/>
         </w:rPr>
-        <w:t xml:space="preserve">{nama_kegiatan} </w:t>
+        <w:t>{NAMA_KEGIATAN} DI {LOKASI_KEGIATAN}</w:t>
       </w:r>
+    </w:p>
+    <w:p>
+      <w:pPr>
+        <w:spacing w:after="0" w:line="276" w:lineRule="auto"/>
+        <w:jc w:val="center"/>
+        <w:rPr>
+          <w:rFonts w:ascii="Arial" w:hAnsi="Arial" w:cs="Arial"/>
+          <w:sz w:val="24"/>
+          <w:szCs w:val="24"/>
+        </w:rPr>
+      </w:pPr>
+      <w:proofErr w:type="gramStart"/>
       <w:r>
         <w:rPr>
           <w:rFonts w:ascii="Arial" w:hAnsi="Arial" w:cs="Arial"/>
           <w:sz w:val="24"/>
           <w:szCs w:val="24"/>
         </w:rPr>
-        <w:t>DI</w:t>
+        <w:t>NOMOR :</w:t>
       </w:r>
+      <w:proofErr w:type="gramEnd"/>
       <w:r>
         <w:rPr>
           <w:rFonts w:ascii="Arial" w:hAnsi="Arial" w:cs="Arial"/>
@@ -307,34 +492,25 @@
           <w:sz w:val="24"/>
           <w:szCs w:val="24"/>
         </w:rPr>
-        <w:t>{lokasi_kegiatan}</w:t>
+        <w:t>{</w:t>
       </w:r>
-    </w:p>
-    <w:p>
-      <w:pPr>
-        <w:spacing w:after="0" w:line="276" w:lineRule="auto"/>
-        <w:jc w:val="center"/>
-        <w:rPr>
-          <w:rFonts w:ascii="Arial" w:hAnsi="Arial" w:cs="Arial"/>
-          <w:sz w:val="24"/>
-          <w:szCs w:val="24"/>
-        </w:rPr>
-      </w:pPr>
+      <w:proofErr w:type="spellStart"/>
       <w:r>
         <w:rPr>
           <w:rFonts w:ascii="Arial" w:hAnsi="Arial" w:cs="Arial"/>
           <w:sz w:val="24"/>
           <w:szCs w:val="24"/>
         </w:rPr>
-        <w:t xml:space="preserve">NOMOR : </w:t>
+        <w:t>nomor_uji_berkas</w:t>
       </w:r>
+      <w:proofErr w:type="spellEnd"/>
       <w:r>
         <w:rPr>
           <w:rFonts w:ascii="Arial" w:hAnsi="Arial" w:cs="Arial"/>
           <w:sz w:val="24"/>
           <w:szCs w:val="24"/>
         </w:rPr>
-        <w:t>{nomor_uji_berkas}</w:t>
+        <w:t>}</w:t>
       </w:r>
     </w:p>
     <w:p>
@@ -421,22 +597,52 @@
                 <w:szCs w:val="24"/>
               </w:rPr>
             </w:pPr>
-            <w:r>
-              <w:rPr>
-                <w:rFonts w:ascii="Arial" w:hAnsi="Arial" w:cs="Arial"/>
-                <w:sz w:val="24"/>
-                <w:szCs w:val="24"/>
-              </w:rPr>
-              <w:t xml:space="preserve">Nomor </w:t>
-            </w:r>
-            <w:r>
-              <w:rPr>
-                <w:rFonts w:ascii="Arial" w:hAnsi="Arial" w:cs="Arial"/>
-                <w:sz w:val="24"/>
-                <w:szCs w:val="24"/>
-              </w:rPr>
-              <w:t>Ceklist Pelayanan</w:t>
-            </w:r>
+            <w:proofErr w:type="spellStart"/>
+            <w:r>
+              <w:rPr>
+                <w:rFonts w:ascii="Arial" w:hAnsi="Arial" w:cs="Arial"/>
+                <w:sz w:val="24"/>
+                <w:szCs w:val="24"/>
+              </w:rPr>
+              <w:t>Nomor</w:t>
+            </w:r>
+            <w:proofErr w:type="spellEnd"/>
+            <w:r>
+              <w:rPr>
+                <w:rFonts w:ascii="Arial" w:hAnsi="Arial" w:cs="Arial"/>
+                <w:sz w:val="24"/>
+                <w:szCs w:val="24"/>
+              </w:rPr>
+              <w:t xml:space="preserve"> </w:t>
+            </w:r>
+            <w:proofErr w:type="spellStart"/>
+            <w:r>
+              <w:rPr>
+                <w:rFonts w:ascii="Arial" w:hAnsi="Arial" w:cs="Arial"/>
+                <w:sz w:val="24"/>
+                <w:szCs w:val="24"/>
+              </w:rPr>
+              <w:t>Ceklist</w:t>
+            </w:r>
+            <w:proofErr w:type="spellEnd"/>
+            <w:r>
+              <w:rPr>
+                <w:rFonts w:ascii="Arial" w:hAnsi="Arial" w:cs="Arial"/>
+                <w:sz w:val="24"/>
+                <w:szCs w:val="24"/>
+              </w:rPr>
+              <w:t xml:space="preserve"> </w:t>
+            </w:r>
+            <w:proofErr w:type="spellStart"/>
+            <w:r>
+              <w:rPr>
+                <w:rFonts w:ascii="Arial" w:hAnsi="Arial" w:cs="Arial"/>
+                <w:sz w:val="24"/>
+                <w:szCs w:val="24"/>
+              </w:rPr>
+              <w:t>Pelayanan</w:t>
+            </w:r>
+            <w:proofErr w:type="spellEnd"/>
           </w:p>
         </w:tc>
         <w:tc>
@@ -482,7 +688,25 @@
                 <w:sz w:val="24"/>
                 <w:szCs w:val="24"/>
               </w:rPr>
-              <w:t>{nomor_checklist}</w:t>
+              <w:t>{</w:t>
+            </w:r>
+            <w:proofErr w:type="spellStart"/>
+            <w:r>
+              <w:rPr>
+                <w:rFonts w:ascii="Arial" w:hAnsi="Arial" w:cs="Arial"/>
+                <w:sz w:val="24"/>
+                <w:szCs w:val="24"/>
+              </w:rPr>
+              <w:t>nomor_checklist</w:t>
+            </w:r>
+            <w:proofErr w:type="spellEnd"/>
+            <w:r>
+              <w:rPr>
+                <w:rFonts w:ascii="Arial" w:hAnsi="Arial" w:cs="Arial"/>
+                <w:sz w:val="24"/>
+                <w:szCs w:val="24"/>
+              </w:rPr>
+              <w:t>}</w:t>
             </w:r>
           </w:p>
         </w:tc>
@@ -507,8 +731,18 @@
                 <w:sz w:val="24"/>
                 <w:szCs w:val="24"/>
               </w:rPr>
-              <w:t>Nama Kegiatan</w:t>
-            </w:r>
+              <w:t xml:space="preserve">Nama </w:t>
+            </w:r>
+            <w:proofErr w:type="spellStart"/>
+            <w:r>
+              <w:rPr>
+                <w:rFonts w:ascii="Arial" w:hAnsi="Arial" w:cs="Arial"/>
+                <w:sz w:val="24"/>
+                <w:szCs w:val="24"/>
+              </w:rPr>
+              <w:t>Kegiatan</w:t>
+            </w:r>
+            <w:proofErr w:type="spellEnd"/>
           </w:p>
         </w:tc>
         <w:tc>
@@ -554,7 +788,25 @@
                 <w:sz w:val="24"/>
                 <w:szCs w:val="24"/>
               </w:rPr>
-              <w:t>{nama_kegiatan}</w:t>
+              <w:t>{</w:t>
+            </w:r>
+            <w:proofErr w:type="spellStart"/>
+            <w:r>
+              <w:rPr>
+                <w:rFonts w:ascii="Arial" w:hAnsi="Arial" w:cs="Arial"/>
+                <w:sz w:val="24"/>
+                <w:szCs w:val="24"/>
+              </w:rPr>
+              <w:t>nama_kegiatan</w:t>
+            </w:r>
+            <w:proofErr w:type="spellEnd"/>
+            <w:r>
+              <w:rPr>
+                <w:rFonts w:ascii="Arial" w:hAnsi="Arial" w:cs="Arial"/>
+                <w:sz w:val="24"/>
+                <w:szCs w:val="24"/>
+              </w:rPr>
+              <w:t>}</w:t>
             </w:r>
           </w:p>
         </w:tc>
@@ -573,14 +825,34 @@
                 <w:szCs w:val="24"/>
               </w:rPr>
             </w:pPr>
-            <w:r>
-              <w:rPr>
-                <w:rFonts w:ascii="Arial" w:hAnsi="Arial" w:cs="Arial"/>
-                <w:sz w:val="24"/>
-                <w:szCs w:val="24"/>
-              </w:rPr>
-              <w:t>Jenis Dokumen</w:t>
-            </w:r>
+            <w:proofErr w:type="spellStart"/>
+            <w:r>
+              <w:rPr>
+                <w:rFonts w:ascii="Arial" w:hAnsi="Arial" w:cs="Arial"/>
+                <w:sz w:val="24"/>
+                <w:szCs w:val="24"/>
+              </w:rPr>
+              <w:t>Jenis</w:t>
+            </w:r>
+            <w:proofErr w:type="spellEnd"/>
+            <w:r>
+              <w:rPr>
+                <w:rFonts w:ascii="Arial" w:hAnsi="Arial" w:cs="Arial"/>
+                <w:sz w:val="24"/>
+                <w:szCs w:val="24"/>
+              </w:rPr>
+              <w:t xml:space="preserve"> </w:t>
+            </w:r>
+            <w:proofErr w:type="spellStart"/>
+            <w:r>
+              <w:rPr>
+                <w:rFonts w:ascii="Arial" w:hAnsi="Arial" w:cs="Arial"/>
+                <w:sz w:val="24"/>
+                <w:szCs w:val="24"/>
+              </w:rPr>
+              <w:t>Dokumen</w:t>
+            </w:r>
+            <w:proofErr w:type="spellEnd"/>
           </w:p>
         </w:tc>
         <w:tc>
@@ -626,7 +898,25 @@
                 <w:sz w:val="24"/>
                 <w:szCs w:val="24"/>
               </w:rPr>
-              <w:t>{jenis_dokumen}</w:t>
+              <w:t>{</w:t>
+            </w:r>
+            <w:proofErr w:type="spellStart"/>
+            <w:r>
+              <w:rPr>
+                <w:rFonts w:ascii="Arial" w:hAnsi="Arial" w:cs="Arial"/>
+                <w:sz w:val="24"/>
+                <w:szCs w:val="24"/>
+              </w:rPr>
+              <w:t>jenis_dokumen</w:t>
+            </w:r>
+            <w:proofErr w:type="spellEnd"/>
+            <w:r>
+              <w:rPr>
+                <w:rFonts w:ascii="Arial" w:hAnsi="Arial" w:cs="Arial"/>
+                <w:sz w:val="24"/>
+                <w:szCs w:val="24"/>
+              </w:rPr>
+              <w:t>}</w:t>
             </w:r>
           </w:p>
         </w:tc>
@@ -645,6 +935,7 @@
                 <w:szCs w:val="24"/>
               </w:rPr>
             </w:pPr>
+            <w:proofErr w:type="spellStart"/>
             <w:r>
               <w:rPr>
                 <w:rFonts w:ascii="Arial" w:hAnsi="Arial" w:cs="Arial"/>
@@ -653,6 +944,7 @@
               </w:rPr>
               <w:t>Kewenangan</w:t>
             </w:r>
+            <w:proofErr w:type="spellEnd"/>
           </w:p>
         </w:tc>
         <w:tc>
@@ -698,7 +990,25 @@
                 <w:sz w:val="24"/>
                 <w:szCs w:val="24"/>
               </w:rPr>
-              <w:t>{kewenangan}</w:t>
+              <w:t>{</w:t>
+            </w:r>
+            <w:proofErr w:type="spellStart"/>
+            <w:r>
+              <w:rPr>
+                <w:rFonts w:ascii="Arial" w:hAnsi="Arial" w:cs="Arial"/>
+                <w:sz w:val="24"/>
+                <w:szCs w:val="24"/>
+              </w:rPr>
+              <w:t>kewenangan</w:t>
+            </w:r>
+            <w:proofErr w:type="spellEnd"/>
+            <w:r>
+              <w:rPr>
+                <w:rFonts w:ascii="Arial" w:hAnsi="Arial" w:cs="Arial"/>
+                <w:sz w:val="24"/>
+                <w:szCs w:val="24"/>
+              </w:rPr>
+              <w:t>}</w:t>
             </w:r>
           </w:p>
         </w:tc>
@@ -723,7 +1033,43 @@
                 <w:sz w:val="24"/>
                 <w:szCs w:val="24"/>
               </w:rPr>
-              <w:t xml:space="preserve">Lokasi Rencana Kegiatan </w:t>
+              <w:t xml:space="preserve">Lokasi </w:t>
+            </w:r>
+            <w:proofErr w:type="spellStart"/>
+            <w:r>
+              <w:rPr>
+                <w:rFonts w:ascii="Arial" w:hAnsi="Arial" w:cs="Arial"/>
+                <w:sz w:val="24"/>
+                <w:szCs w:val="24"/>
+              </w:rPr>
+              <w:t>Rencana</w:t>
+            </w:r>
+            <w:proofErr w:type="spellEnd"/>
+            <w:r>
+              <w:rPr>
+                <w:rFonts w:ascii="Arial" w:hAnsi="Arial" w:cs="Arial"/>
+                <w:sz w:val="24"/>
+                <w:szCs w:val="24"/>
+              </w:rPr>
+              <w:t xml:space="preserve"> </w:t>
+            </w:r>
+            <w:proofErr w:type="spellStart"/>
+            <w:r>
+              <w:rPr>
+                <w:rFonts w:ascii="Arial" w:hAnsi="Arial" w:cs="Arial"/>
+                <w:sz w:val="24"/>
+                <w:szCs w:val="24"/>
+              </w:rPr>
+              <w:t>Kegiatan</w:t>
+            </w:r>
+            <w:proofErr w:type="spellEnd"/>
+            <w:r>
+              <w:rPr>
+                <w:rFonts w:ascii="Arial" w:hAnsi="Arial" w:cs="Arial"/>
+                <w:sz w:val="24"/>
+                <w:szCs w:val="24"/>
+              </w:rPr>
+              <w:t xml:space="preserve"> </w:t>
             </w:r>
           </w:p>
         </w:tc>
@@ -770,7 +1116,25 @@
                 <w:sz w:val="24"/>
                 <w:szCs w:val="24"/>
               </w:rPr>
-              <w:t>{lokasi_kegiatan}</w:t>
+              <w:t>{</w:t>
+            </w:r>
+            <w:proofErr w:type="spellStart"/>
+            <w:r>
+              <w:rPr>
+                <w:rFonts w:ascii="Arial" w:hAnsi="Arial" w:cs="Arial"/>
+                <w:sz w:val="24"/>
+                <w:szCs w:val="24"/>
+              </w:rPr>
+              <w:t>lokasi_kegiatan</w:t>
+            </w:r>
+            <w:proofErr w:type="spellEnd"/>
+            <w:r>
+              <w:rPr>
+                <w:rFonts w:ascii="Arial" w:hAnsi="Arial" w:cs="Arial"/>
+                <w:sz w:val="24"/>
+                <w:szCs w:val="24"/>
+              </w:rPr>
+              <w:t>}</w:t>
             </w:r>
           </w:p>
         </w:tc>
@@ -842,7 +1206,25 @@
                 <w:sz w:val="24"/>
                 <w:szCs w:val="24"/>
               </w:rPr>
-              <w:t>{kbli}</w:t>
+              <w:t>{</w:t>
+            </w:r>
+            <w:proofErr w:type="spellStart"/>
+            <w:r>
+              <w:rPr>
+                <w:rFonts w:ascii="Arial" w:hAnsi="Arial" w:cs="Arial"/>
+                <w:sz w:val="24"/>
+                <w:szCs w:val="24"/>
+              </w:rPr>
+              <w:t>kbli</w:t>
+            </w:r>
+            <w:proofErr w:type="spellEnd"/>
+            <w:r>
+              <w:rPr>
+                <w:rFonts w:ascii="Arial" w:hAnsi="Arial" w:cs="Arial"/>
+                <w:sz w:val="24"/>
+                <w:szCs w:val="24"/>
+              </w:rPr>
+              <w:t>}</w:t>
             </w:r>
           </w:p>
         </w:tc>
@@ -867,8 +1249,18 @@
                 <w:sz w:val="24"/>
                 <w:szCs w:val="24"/>
               </w:rPr>
-              <w:t>Nama Pemrakarsa</w:t>
-            </w:r>
+              <w:t xml:space="preserve">Nama </w:t>
+            </w:r>
+            <w:proofErr w:type="spellStart"/>
+            <w:r>
+              <w:rPr>
+                <w:rFonts w:ascii="Arial" w:hAnsi="Arial" w:cs="Arial"/>
+                <w:sz w:val="24"/>
+                <w:szCs w:val="24"/>
+              </w:rPr>
+              <w:t>Pemrakarsa</w:t>
+            </w:r>
+            <w:proofErr w:type="spellEnd"/>
           </w:p>
         </w:tc>
         <w:tc>
@@ -914,7 +1306,25 @@
                 <w:sz w:val="24"/>
                 <w:szCs w:val="24"/>
               </w:rPr>
-              <w:t>{nama_pemrakarsa}</w:t>
+              <w:t>{</w:t>
+            </w:r>
+            <w:proofErr w:type="spellStart"/>
+            <w:r>
+              <w:rPr>
+                <w:rFonts w:ascii="Arial" w:hAnsi="Arial" w:cs="Arial"/>
+                <w:sz w:val="24"/>
+                <w:szCs w:val="24"/>
+              </w:rPr>
+              <w:t>nama_pemrakarsa</w:t>
+            </w:r>
+            <w:proofErr w:type="spellEnd"/>
+            <w:r>
+              <w:rPr>
+                <w:rFonts w:ascii="Arial" w:hAnsi="Arial" w:cs="Arial"/>
+                <w:sz w:val="24"/>
+                <w:szCs w:val="24"/>
+              </w:rPr>
+              <w:t>}</w:t>
             </w:r>
           </w:p>
         </w:tc>
@@ -986,7 +1396,25 @@
                 <w:sz w:val="24"/>
                 <w:szCs w:val="24"/>
               </w:rPr>
-              <w:t>{telepon_pemrakarsa}</w:t>
+              <w:t>{</w:t>
+            </w:r>
+            <w:proofErr w:type="spellStart"/>
+            <w:r>
+              <w:rPr>
+                <w:rFonts w:ascii="Arial" w:hAnsi="Arial" w:cs="Arial"/>
+                <w:sz w:val="24"/>
+                <w:szCs w:val="24"/>
+              </w:rPr>
+              <w:t>telepon_pemrakarsa</w:t>
+            </w:r>
+            <w:proofErr w:type="spellEnd"/>
+            <w:r>
+              <w:rPr>
+                <w:rFonts w:ascii="Arial" w:hAnsi="Arial" w:cs="Arial"/>
+                <w:sz w:val="24"/>
+                <w:szCs w:val="24"/>
+              </w:rPr>
+              <w:t>}</w:t>
             </w:r>
           </w:p>
         </w:tc>
@@ -1033,7 +1461,169 @@
           <w:sz w:val="24"/>
           <w:szCs w:val="24"/>
         </w:rPr>
-        <w:t xml:space="preserve"> Administrasi Dokumen Lingkungan telah melakukan pemeriksaan </w:t>
+        <w:t xml:space="preserve"> </w:t>
+      </w:r>
+      <w:proofErr w:type="spellStart"/>
+      <w:r>
+        <w:rPr>
+          <w:rFonts w:ascii="Arial" w:hAnsi="Arial" w:cs="Arial"/>
+          <w:sz w:val="24"/>
+          <w:szCs w:val="24"/>
+        </w:rPr>
+        <w:t>Administrasi</w:t>
+      </w:r>
+      <w:proofErr w:type="spellEnd"/>
+      <w:r>
+        <w:rPr>
+          <w:rFonts w:ascii="Arial" w:hAnsi="Arial" w:cs="Arial"/>
+          <w:sz w:val="24"/>
+          <w:szCs w:val="24"/>
+        </w:rPr>
+        <w:t xml:space="preserve"> </w:t>
+      </w:r>
+      <w:proofErr w:type="spellStart"/>
+      <w:r>
+        <w:rPr>
+          <w:rFonts w:ascii="Arial" w:hAnsi="Arial" w:cs="Arial"/>
+          <w:sz w:val="24"/>
+          <w:szCs w:val="24"/>
+        </w:rPr>
+        <w:t>Dokumen</w:t>
+      </w:r>
+      <w:proofErr w:type="spellEnd"/>
+      <w:r>
+        <w:rPr>
+          <w:rFonts w:ascii="Arial" w:hAnsi="Arial" w:cs="Arial"/>
+          <w:sz w:val="24"/>
+          <w:szCs w:val="24"/>
+        </w:rPr>
+        <w:t xml:space="preserve"> </w:t>
+      </w:r>
+      <w:proofErr w:type="spellStart"/>
+      <w:r>
+        <w:rPr>
+          <w:rFonts w:ascii="Arial" w:hAnsi="Arial" w:cs="Arial"/>
+          <w:sz w:val="24"/>
+          <w:szCs w:val="24"/>
+        </w:rPr>
+        <w:t>Lingkungan</w:t>
+      </w:r>
+      <w:proofErr w:type="spellEnd"/>
+      <w:r>
+        <w:rPr>
+          <w:rFonts w:ascii="Arial" w:hAnsi="Arial" w:cs="Arial"/>
+          <w:sz w:val="24"/>
+          <w:szCs w:val="24"/>
+        </w:rPr>
+        <w:t xml:space="preserve"> </w:t>
+      </w:r>
+      <w:proofErr w:type="spellStart"/>
+      <w:r>
+        <w:rPr>
+          <w:rFonts w:ascii="Arial" w:hAnsi="Arial" w:cs="Arial"/>
+          <w:sz w:val="24"/>
+          <w:szCs w:val="24"/>
+        </w:rPr>
+        <w:t>telah</w:t>
+      </w:r>
+      <w:proofErr w:type="spellEnd"/>
+      <w:r>
+        <w:rPr>
+          <w:rFonts w:ascii="Arial" w:hAnsi="Arial" w:cs="Arial"/>
+          <w:sz w:val="24"/>
+          <w:szCs w:val="24"/>
+        </w:rPr>
+        <w:t xml:space="preserve"> </w:t>
+      </w:r>
+      <w:proofErr w:type="spellStart"/>
+      <w:r>
+        <w:rPr>
+          <w:rFonts w:ascii="Arial" w:hAnsi="Arial" w:cs="Arial"/>
+          <w:sz w:val="24"/>
+          <w:szCs w:val="24"/>
+        </w:rPr>
+        <w:t>melakukan</w:t>
+      </w:r>
+      <w:proofErr w:type="spellEnd"/>
+      <w:r>
+        <w:rPr>
+          <w:rFonts w:ascii="Arial" w:hAnsi="Arial" w:cs="Arial"/>
+          <w:sz w:val="24"/>
+          <w:szCs w:val="24"/>
+        </w:rPr>
+        <w:t xml:space="preserve"> </w:t>
+      </w:r>
+      <w:proofErr w:type="spellStart"/>
+      <w:r>
+        <w:rPr>
+          <w:rFonts w:ascii="Arial" w:hAnsi="Arial" w:cs="Arial"/>
+          <w:sz w:val="24"/>
+          <w:szCs w:val="24"/>
+        </w:rPr>
+        <w:t>pemeriksaan</w:t>
+      </w:r>
+      <w:proofErr w:type="spellEnd"/>
+      <w:r>
+        <w:rPr>
+          <w:rFonts w:ascii="Arial" w:hAnsi="Arial" w:cs="Arial"/>
+          <w:sz w:val="24"/>
+          <w:szCs w:val="24"/>
+        </w:rPr>
+        <w:t xml:space="preserve"> </w:t>
+      </w:r>
+      <w:proofErr w:type="spellStart"/>
+      <w:r>
+        <w:rPr>
+          <w:rFonts w:ascii="Arial" w:hAnsi="Arial" w:cs="Arial"/>
+          <w:sz w:val="24"/>
+          <w:szCs w:val="24"/>
+        </w:rPr>
+        <w:t>berkas</w:t>
+      </w:r>
+      <w:proofErr w:type="spellEnd"/>
+      <w:r>
+        <w:rPr>
+          <w:rFonts w:ascii="Arial" w:hAnsi="Arial" w:cs="Arial"/>
+          <w:sz w:val="24"/>
+          <w:szCs w:val="24"/>
+        </w:rPr>
+        <w:t xml:space="preserve"> </w:t>
+      </w:r>
+      <w:proofErr w:type="spellStart"/>
+      <w:r>
+        <w:rPr>
+          <w:rFonts w:ascii="Arial" w:hAnsi="Arial" w:cs="Arial"/>
+          <w:sz w:val="24"/>
+          <w:szCs w:val="24"/>
+        </w:rPr>
+        <w:t>administrasi</w:t>
+      </w:r>
+      <w:proofErr w:type="spellEnd"/>
+      <w:r>
+        <w:rPr>
+          <w:rFonts w:ascii="Arial" w:hAnsi="Arial" w:cs="Arial"/>
+          <w:sz w:val="24"/>
+          <w:szCs w:val="24"/>
+        </w:rPr>
+        <w:t xml:space="preserve"> </w:t>
+      </w:r>
+      <w:proofErr w:type="spellStart"/>
+      <w:r>
+        <w:rPr>
+          <w:rFonts w:ascii="Arial" w:hAnsi="Arial" w:cs="Arial"/>
+          <w:sz w:val="24"/>
+          <w:szCs w:val="24"/>
+        </w:rPr>
+        <w:t>dokumen</w:t>
+      </w:r>
+      <w:proofErr w:type="spellEnd"/>
+      <w:r>
+        <w:rPr>
+          <w:rFonts w:ascii="Arial" w:hAnsi="Arial" w:cs="Arial"/>
+          <w:sz w:val="24"/>
+          <w:szCs w:val="24"/>
+        </w:rPr>
+        <w:t xml:space="preserve"> </w:t>
       </w:r>
       <w:r>
         <w:rPr>
@@ -1041,23 +1631,25 @@
           <w:sz w:val="24"/>
           <w:szCs w:val="24"/>
         </w:rPr>
-        <w:t>berkas administrasi</w:t>
+        <w:t>{</w:t>
       </w:r>
+      <w:proofErr w:type="spellStart"/>
       <w:r>
         <w:rPr>
           <w:rFonts w:ascii="Arial" w:hAnsi="Arial" w:cs="Arial"/>
           <w:sz w:val="24"/>
           <w:szCs w:val="24"/>
         </w:rPr>
-        <w:t xml:space="preserve"> dokumen </w:t>
+        <w:t>nama_kegiatan</w:t>
       </w:r>
+      <w:proofErr w:type="spellEnd"/>
       <w:r>
         <w:rPr>
           <w:rFonts w:ascii="Arial" w:hAnsi="Arial" w:cs="Arial"/>
           <w:sz w:val="24"/>
           <w:szCs w:val="24"/>
         </w:rPr>
-        <w:t>{nama_kegiatan}</w:t>
+        <w:t>}</w:t>
       </w:r>
       <w:r>
         <w:rPr>
@@ -1073,7 +1665,25 @@
           <w:sz w:val="24"/>
           <w:szCs w:val="24"/>
         </w:rPr>
-        <w:t xml:space="preserve">{lokasi_kegiatan} </w:t>
+        <w:t>{</w:t>
+      </w:r>
+      <w:proofErr w:type="spellStart"/>
+      <w:r>
+        <w:rPr>
+          <w:rFonts w:ascii="Arial" w:hAnsi="Arial" w:cs="Arial"/>
+          <w:sz w:val="24"/>
+          <w:szCs w:val="24"/>
+        </w:rPr>
+        <w:t>lokasi_kegiatan</w:t>
+      </w:r>
+      <w:proofErr w:type="spellEnd"/>
+      <w:r>
+        <w:rPr>
+          <w:rFonts w:ascii="Arial" w:hAnsi="Arial" w:cs="Arial"/>
+          <w:sz w:val="24"/>
+          <w:szCs w:val="24"/>
+        </w:rPr>
+        <w:t xml:space="preserve">} </w:t>
       </w:r>
       <w:r>
         <w:rPr>
@@ -1097,7 +1707,61 @@
           <w:sz w:val="24"/>
           <w:szCs w:val="24"/>
         </w:rPr>
-        <w:t xml:space="preserve">{nama_pemrakarsa} </w:t>
+        <w:t>{</w:t>
+      </w:r>
+      <w:proofErr w:type="spellStart"/>
+      <w:r>
+        <w:rPr>
+          <w:rFonts w:ascii="Arial" w:hAnsi="Arial" w:cs="Arial"/>
+          <w:sz w:val="24"/>
+          <w:szCs w:val="24"/>
+        </w:rPr>
+        <w:t>nama_pemrakarsa</w:t>
+      </w:r>
+      <w:proofErr w:type="spellEnd"/>
+      <w:r>
+        <w:rPr>
+          <w:rFonts w:ascii="Arial" w:hAnsi="Arial" w:cs="Arial"/>
+          <w:sz w:val="24"/>
+          <w:szCs w:val="24"/>
+        </w:rPr>
+        <w:t xml:space="preserve">} </w:t>
+      </w:r>
+      <w:proofErr w:type="spellStart"/>
+      <w:r>
+        <w:rPr>
+          <w:rFonts w:ascii="Arial" w:hAnsi="Arial" w:cs="Arial"/>
+          <w:sz w:val="24"/>
+          <w:szCs w:val="24"/>
+        </w:rPr>
+        <w:t>selaku</w:t>
+      </w:r>
+      <w:proofErr w:type="spellEnd"/>
+      <w:r>
+        <w:rPr>
+          <w:rFonts w:ascii="Arial" w:hAnsi="Arial" w:cs="Arial"/>
+          <w:sz w:val="24"/>
+          <w:szCs w:val="24"/>
+        </w:rPr>
+        <w:t xml:space="preserve"> </w:t>
+      </w:r>
+      <w:proofErr w:type="spellStart"/>
+      <w:r>
+        <w:rPr>
+          <w:rFonts w:ascii="Arial" w:hAnsi="Arial" w:cs="Arial"/>
+          <w:sz w:val="24"/>
+          <w:szCs w:val="24"/>
+        </w:rPr>
+        <w:t>Pemilik</w:t>
+      </w:r>
+      <w:proofErr w:type="spellEnd"/>
+      <w:r>
+        <w:rPr>
+          <w:rFonts w:ascii="Arial" w:hAnsi="Arial" w:cs="Arial"/>
+          <w:sz w:val="24"/>
+          <w:szCs w:val="24"/>
+        </w:rPr>
+        <w:t xml:space="preserve"> Usaha</w:t>
       </w:r>
       <w:r>
         <w:rPr>
@@ -1105,16 +1769,64 @@
           <w:sz w:val="24"/>
           <w:szCs w:val="24"/>
         </w:rPr>
-        <w:t>selaku Pemilik Usaha</w:t>
+        <w:t xml:space="preserve"> </w:t>
       </w:r>
+      <w:proofErr w:type="spellStart"/>
       <w:r>
         <w:rPr>
           <w:rFonts w:ascii="Arial" w:hAnsi="Arial" w:cs="Arial"/>
           <w:sz w:val="24"/>
           <w:szCs w:val="24"/>
         </w:rPr>
-        <w:t xml:space="preserve"> hasil sebagai berikut :</w:t>
+        <w:t>hasil</w:t>
       </w:r>
+      <w:proofErr w:type="spellEnd"/>
+      <w:r>
+        <w:rPr>
+          <w:rFonts w:ascii="Arial" w:hAnsi="Arial" w:cs="Arial"/>
+          <w:sz w:val="24"/>
+          <w:szCs w:val="24"/>
+        </w:rPr>
+        <w:t xml:space="preserve"> </w:t>
+      </w:r>
+      <w:proofErr w:type="spellStart"/>
+      <w:r>
+        <w:rPr>
+          <w:rFonts w:ascii="Arial" w:hAnsi="Arial" w:cs="Arial"/>
+          <w:sz w:val="24"/>
+          <w:szCs w:val="24"/>
+        </w:rPr>
+        <w:t>sebagai</w:t>
+      </w:r>
+      <w:proofErr w:type="spellEnd"/>
+      <w:r>
+        <w:rPr>
+          <w:rFonts w:ascii="Arial" w:hAnsi="Arial" w:cs="Arial"/>
+          <w:sz w:val="24"/>
+          <w:szCs w:val="24"/>
+        </w:rPr>
+        <w:t xml:space="preserve"> </w:t>
+      </w:r>
+      <w:proofErr w:type="spellStart"/>
+      <w:proofErr w:type="gramStart"/>
+      <w:r>
+        <w:rPr>
+          <w:rFonts w:ascii="Arial" w:hAnsi="Arial" w:cs="Arial"/>
+          <w:sz w:val="24"/>
+          <w:szCs w:val="24"/>
+        </w:rPr>
+        <w:t>berikut</w:t>
+      </w:r>
+      <w:proofErr w:type="spellEnd"/>
+      <w:r>
+        <w:rPr>
+          <w:rFonts w:ascii="Arial" w:hAnsi="Arial" w:cs="Arial"/>
+          <w:sz w:val="24"/>
+          <w:szCs w:val="24"/>
+        </w:rPr>
+        <w:t xml:space="preserve"> :</w:t>
+      </w:r>
+      <w:proofErr w:type="gramEnd"/>
     </w:p>
     <w:tbl>
       <w:tblPr>
@@ -1261,6 +1973,7 @@
                 <w14:ligatures w14:val="none"/>
               </w:rPr>
             </w:pPr>
+            <w:proofErr w:type="spellStart"/>
             <w:r>
               <w:rPr>
                 <w:rFonts w:ascii="Arial" w:eastAsia="Times New Roman" w:hAnsi="Arial" w:cs="Arial"/>
@@ -1271,8 +1984,35 @@
                 <w:szCs w:val="20"/>
                 <w14:ligatures w14:val="none"/>
               </w:rPr>
-              <w:t>Kelengkapan Administrasi</w:t>
-            </w:r>
+              <w:t>Kelengkapan</w:t>
+            </w:r>
+            <w:proofErr w:type="spellEnd"/>
+            <w:r>
+              <w:rPr>
+                <w:rFonts w:ascii="Arial" w:eastAsia="Times New Roman" w:hAnsi="Arial" w:cs="Arial"/>
+                <w:b/>
+                <w:bCs/>
+                <w:kern w:val="0"/>
+                <w:sz w:val="20"/>
+                <w:szCs w:val="20"/>
+                <w14:ligatures w14:val="none"/>
+              </w:rPr>
+              <w:t xml:space="preserve"> </w:t>
+            </w:r>
+            <w:proofErr w:type="spellStart"/>
+            <w:r>
+              <w:rPr>
+                <w:rFonts w:ascii="Arial" w:eastAsia="Times New Roman" w:hAnsi="Arial" w:cs="Arial"/>
+                <w:b/>
+                <w:bCs/>
+                <w:kern w:val="0"/>
+                <w:sz w:val="20"/>
+                <w:szCs w:val="20"/>
+                <w14:ligatures w14:val="none"/>
+              </w:rPr>
+              <w:t>Administrasi</w:t>
+            </w:r>
+            <w:proofErr w:type="spellEnd"/>
           </w:p>
         </w:tc>
         <w:tc>
@@ -1342,6 +2082,7 @@
                 <w14:ligatures w14:val="none"/>
               </w:rPr>
             </w:pPr>
+            <w:proofErr w:type="spellStart"/>
             <w:r>
               <w:rPr>
                 <w:rFonts w:ascii="Arial" w:eastAsia="Times New Roman" w:hAnsi="Arial" w:cs="Arial"/>
@@ -1352,7 +2093,20 @@
                 <w:szCs w:val="20"/>
                 <w14:ligatures w14:val="none"/>
               </w:rPr>
-              <w:t>Tidak Ada</w:t>
+              <w:t>Tidak</w:t>
+            </w:r>
+            <w:proofErr w:type="spellEnd"/>
+            <w:r>
+              <w:rPr>
+                <w:rFonts w:ascii="Arial" w:eastAsia="Times New Roman" w:hAnsi="Arial" w:cs="Arial"/>
+                <w:b/>
+                <w:bCs/>
+                <w:kern w:val="0"/>
+                <w:sz w:val="20"/>
+                <w:szCs w:val="20"/>
+                <w14:ligatures w14:val="none"/>
+              </w:rPr>
+              <w:t xml:space="preserve"> Ada</w:t>
             </w:r>
           </w:p>
         </w:tc>
@@ -1382,6 +2136,7 @@
                 <w14:ligatures w14:val="none"/>
               </w:rPr>
             </w:pPr>
+            <w:proofErr w:type="spellStart"/>
             <w:r>
               <w:rPr>
                 <w:rFonts w:ascii="Arial" w:eastAsia="Times New Roman" w:hAnsi="Arial" w:cs="Arial"/>
@@ -1394,6 +2149,7 @@
               </w:rPr>
               <w:t>Sesuai</w:t>
             </w:r>
+            <w:proofErr w:type="spellEnd"/>
           </w:p>
         </w:tc>
         <w:tc>
@@ -1422,6 +2178,7 @@
                 <w14:ligatures w14:val="none"/>
               </w:rPr>
             </w:pPr>
+            <w:proofErr w:type="spellStart"/>
             <w:r>
               <w:rPr>
                 <w:rFonts w:ascii="Arial" w:eastAsia="Times New Roman" w:hAnsi="Arial" w:cs="Arial"/>
@@ -1432,8 +2189,35 @@
                 <w:szCs w:val="20"/>
                 <w14:ligatures w14:val="none"/>
               </w:rPr>
-              <w:t>Tidak Sesuai</w:t>
-            </w:r>
+              <w:t>Tidak</w:t>
+            </w:r>
+            <w:proofErr w:type="spellEnd"/>
+            <w:r>
+              <w:rPr>
+                <w:rFonts w:ascii="Arial" w:eastAsia="Times New Roman" w:hAnsi="Arial" w:cs="Arial"/>
+                <w:b/>
+                <w:bCs/>
+                <w:kern w:val="0"/>
+                <w:sz w:val="20"/>
+                <w:szCs w:val="20"/>
+                <w14:ligatures w14:val="none"/>
+              </w:rPr>
+              <w:t xml:space="preserve"> </w:t>
+            </w:r>
+            <w:proofErr w:type="spellStart"/>
+            <w:r>
+              <w:rPr>
+                <w:rFonts w:ascii="Arial" w:eastAsia="Times New Roman" w:hAnsi="Arial" w:cs="Arial"/>
+                <w:b/>
+                <w:bCs/>
+                <w:kern w:val="0"/>
+                <w:sz w:val="20"/>
+                <w:szCs w:val="20"/>
+                <w14:ligatures w14:val="none"/>
+              </w:rPr>
+              <w:t>Sesuai</w:t>
+            </w:r>
+            <w:proofErr w:type="spellEnd"/>
           </w:p>
         </w:tc>
         <w:tc>
@@ -1462,6 +2246,7 @@
                 <w14:ligatures w14:val="none"/>
               </w:rPr>
             </w:pPr>
+            <w:proofErr w:type="spellStart"/>
             <w:r>
               <w:rPr>
                 <w:rFonts w:ascii="Arial" w:eastAsia="Times New Roman" w:hAnsi="Arial" w:cs="Arial"/>
@@ -1474,6 +2259,7 @@
               </w:rPr>
               <w:t>Keterangan</w:t>
             </w:r>
+            <w:proofErr w:type="spellEnd"/>
           </w:p>
         </w:tc>
       </w:tr>
@@ -1554,7 +2340,73 @@
                 <w:szCs w:val="20"/>
                 <w14:ligatures w14:val="none"/>
               </w:rPr>
-              <w:t>Surat Permohonan Pemeriksaan Dokumen UKL-UPL / SPPL</w:t>
+              <w:t xml:space="preserve">Surat </w:t>
+            </w:r>
+            <w:proofErr w:type="spellStart"/>
+            <w:r>
+              <w:rPr>
+                <w:rFonts w:ascii="Arial" w:eastAsia="Times New Roman" w:hAnsi="Arial" w:cs="Arial"/>
+                <w:kern w:val="0"/>
+                <w:sz w:val="20"/>
+                <w:szCs w:val="20"/>
+                <w14:ligatures w14:val="none"/>
+              </w:rPr>
+              <w:t>Permohonan</w:t>
+            </w:r>
+            <w:proofErr w:type="spellEnd"/>
+            <w:r>
+              <w:rPr>
+                <w:rFonts w:ascii="Arial" w:eastAsia="Times New Roman" w:hAnsi="Arial" w:cs="Arial"/>
+                <w:kern w:val="0"/>
+                <w:sz w:val="20"/>
+                <w:szCs w:val="20"/>
+                <w14:ligatures w14:val="none"/>
+              </w:rPr>
+              <w:t xml:space="preserve"> </w:t>
+            </w:r>
+            <w:proofErr w:type="spellStart"/>
+            <w:r>
+              <w:rPr>
+                <w:rFonts w:ascii="Arial" w:eastAsia="Times New Roman" w:hAnsi="Arial" w:cs="Arial"/>
+                <w:kern w:val="0"/>
+                <w:sz w:val="20"/>
+                <w:szCs w:val="20"/>
+                <w14:ligatures w14:val="none"/>
+              </w:rPr>
+              <w:t>Pemeriksaan</w:t>
+            </w:r>
+            <w:proofErr w:type="spellEnd"/>
+            <w:r>
+              <w:rPr>
+                <w:rFonts w:ascii="Arial" w:eastAsia="Times New Roman" w:hAnsi="Arial" w:cs="Arial"/>
+                <w:kern w:val="0"/>
+                <w:sz w:val="20"/>
+                <w:szCs w:val="20"/>
+                <w14:ligatures w14:val="none"/>
+              </w:rPr>
+              <w:t xml:space="preserve"> </w:t>
+            </w:r>
+            <w:proofErr w:type="spellStart"/>
+            <w:r>
+              <w:rPr>
+                <w:rFonts w:ascii="Arial" w:eastAsia="Times New Roman" w:hAnsi="Arial" w:cs="Arial"/>
+                <w:kern w:val="0"/>
+                <w:sz w:val="20"/>
+                <w:szCs w:val="20"/>
+                <w14:ligatures w14:val="none"/>
+              </w:rPr>
+              <w:t>Dokumen</w:t>
+            </w:r>
+            <w:proofErr w:type="spellEnd"/>
+            <w:r>
+              <w:rPr>
+                <w:rFonts w:ascii="Arial" w:eastAsia="Times New Roman" w:hAnsi="Arial" w:cs="Arial"/>
+                <w:kern w:val="0"/>
+                <w:sz w:val="20"/>
+                <w:szCs w:val="20"/>
+                <w14:ligatures w14:val="none"/>
+              </w:rPr>
+              <w:t xml:space="preserve"> UKL-UPL / SPPL</w:t>
             </w:r>
           </w:p>
         </w:tc>
@@ -1807,15 +2659,115 @@
                 <w14:ligatures w14:val="none"/>
               </w:rPr>
             </w:pPr>
-            <w:r>
-              <w:rPr>
-                <w:rFonts w:ascii="Arial" w:eastAsia="Times New Roman" w:hAnsi="Arial" w:cs="Arial"/>
-                <w:kern w:val="0"/>
-                <w:sz w:val="20"/>
-                <w:szCs w:val="20"/>
-                <w14:ligatures w14:val="none"/>
-              </w:rPr>
-              <w:t>Pernyataan Pengelolaan dan Pemantauan Lingkungan (Bermaterai)</w:t>
+            <w:proofErr w:type="spellStart"/>
+            <w:r>
+              <w:rPr>
+                <w:rFonts w:ascii="Arial" w:eastAsia="Times New Roman" w:hAnsi="Arial" w:cs="Arial"/>
+                <w:kern w:val="0"/>
+                <w:sz w:val="20"/>
+                <w:szCs w:val="20"/>
+                <w14:ligatures w14:val="none"/>
+              </w:rPr>
+              <w:t>Pernyataan</w:t>
+            </w:r>
+            <w:proofErr w:type="spellEnd"/>
+            <w:r>
+              <w:rPr>
+                <w:rFonts w:ascii="Arial" w:eastAsia="Times New Roman" w:hAnsi="Arial" w:cs="Arial"/>
+                <w:kern w:val="0"/>
+                <w:sz w:val="20"/>
+                <w:szCs w:val="20"/>
+                <w14:ligatures w14:val="none"/>
+              </w:rPr>
+              <w:t xml:space="preserve"> </w:t>
+            </w:r>
+            <w:proofErr w:type="spellStart"/>
+            <w:r>
+              <w:rPr>
+                <w:rFonts w:ascii="Arial" w:eastAsia="Times New Roman" w:hAnsi="Arial" w:cs="Arial"/>
+                <w:kern w:val="0"/>
+                <w:sz w:val="20"/>
+                <w:szCs w:val="20"/>
+                <w14:ligatures w14:val="none"/>
+              </w:rPr>
+              <w:t>Pengelolaan</w:t>
+            </w:r>
+            <w:proofErr w:type="spellEnd"/>
+            <w:r>
+              <w:rPr>
+                <w:rFonts w:ascii="Arial" w:eastAsia="Times New Roman" w:hAnsi="Arial" w:cs="Arial"/>
+                <w:kern w:val="0"/>
+                <w:sz w:val="20"/>
+                <w:szCs w:val="20"/>
+                <w14:ligatures w14:val="none"/>
+              </w:rPr>
+              <w:t xml:space="preserve"> dan </w:t>
+            </w:r>
+            <w:proofErr w:type="spellStart"/>
+            <w:r>
+              <w:rPr>
+                <w:rFonts w:ascii="Arial" w:eastAsia="Times New Roman" w:hAnsi="Arial" w:cs="Arial"/>
+                <w:kern w:val="0"/>
+                <w:sz w:val="20"/>
+                <w:szCs w:val="20"/>
+                <w14:ligatures w14:val="none"/>
+              </w:rPr>
+              <w:t>Pemantauan</w:t>
+            </w:r>
+            <w:proofErr w:type="spellEnd"/>
+            <w:r>
+              <w:rPr>
+                <w:rFonts w:ascii="Arial" w:eastAsia="Times New Roman" w:hAnsi="Arial" w:cs="Arial"/>
+                <w:kern w:val="0"/>
+                <w:sz w:val="20"/>
+                <w:szCs w:val="20"/>
+                <w14:ligatures w14:val="none"/>
+              </w:rPr>
+              <w:t xml:space="preserve"> </w:t>
+            </w:r>
+            <w:proofErr w:type="spellStart"/>
+            <w:r>
+              <w:rPr>
+                <w:rFonts w:ascii="Arial" w:eastAsia="Times New Roman" w:hAnsi="Arial" w:cs="Arial"/>
+                <w:kern w:val="0"/>
+                <w:sz w:val="20"/>
+                <w:szCs w:val="20"/>
+                <w14:ligatures w14:val="none"/>
+              </w:rPr>
+              <w:t>Lingkungan</w:t>
+            </w:r>
+            <w:proofErr w:type="spellEnd"/>
+            <w:r>
+              <w:rPr>
+                <w:rFonts w:ascii="Arial" w:eastAsia="Times New Roman" w:hAnsi="Arial" w:cs="Arial"/>
+                <w:kern w:val="0"/>
+                <w:sz w:val="20"/>
+                <w:szCs w:val="20"/>
+                <w14:ligatures w14:val="none"/>
+              </w:rPr>
+              <w:t xml:space="preserve"> (</w:t>
+            </w:r>
+            <w:proofErr w:type="spellStart"/>
+            <w:r>
+              <w:rPr>
+                <w:rFonts w:ascii="Arial" w:eastAsia="Times New Roman" w:hAnsi="Arial" w:cs="Arial"/>
+                <w:kern w:val="0"/>
+                <w:sz w:val="20"/>
+                <w:szCs w:val="20"/>
+                <w14:ligatures w14:val="none"/>
+              </w:rPr>
+              <w:t>Bermaterai</w:t>
+            </w:r>
+            <w:proofErr w:type="spellEnd"/>
+            <w:r>
+              <w:rPr>
+                <w:rFonts w:ascii="Arial" w:eastAsia="Times New Roman" w:hAnsi="Arial" w:cs="Arial"/>
+                <w:kern w:val="0"/>
+                <w:sz w:val="20"/>
+                <w:szCs w:val="20"/>
+                <w14:ligatures w14:val="none"/>
+              </w:rPr>
+              <w:t>)</w:t>
             </w:r>
           </w:p>
         </w:tc>
@@ -2068,16 +3020,40 @@
                 <w14:ligatures w14:val="none"/>
               </w:rPr>
             </w:pPr>
-            <w:r>
-              <w:rPr>
-                <w:rFonts w:ascii="Arial" w:eastAsia="Times New Roman" w:hAnsi="Arial" w:cs="Arial"/>
-                <w:kern w:val="0"/>
-                <w:sz w:val="20"/>
-                <w:szCs w:val="20"/>
-                <w14:ligatures w14:val="none"/>
-              </w:rPr>
-              <w:t>Dokumen Lingkungan</w:t>
-            </w:r>
+            <w:proofErr w:type="spellStart"/>
+            <w:r>
+              <w:rPr>
+                <w:rFonts w:ascii="Arial" w:eastAsia="Times New Roman" w:hAnsi="Arial" w:cs="Arial"/>
+                <w:kern w:val="0"/>
+                <w:sz w:val="20"/>
+                <w:szCs w:val="20"/>
+                <w14:ligatures w14:val="none"/>
+              </w:rPr>
+              <w:t>Dokumen</w:t>
+            </w:r>
+            <w:proofErr w:type="spellEnd"/>
+            <w:r>
+              <w:rPr>
+                <w:rFonts w:ascii="Arial" w:eastAsia="Times New Roman" w:hAnsi="Arial" w:cs="Arial"/>
+                <w:kern w:val="0"/>
+                <w:sz w:val="20"/>
+                <w:szCs w:val="20"/>
+                <w14:ligatures w14:val="none"/>
+              </w:rPr>
+              <w:t xml:space="preserve"> </w:t>
+            </w:r>
+            <w:proofErr w:type="spellStart"/>
+            <w:r>
+              <w:rPr>
+                <w:rFonts w:ascii="Arial" w:eastAsia="Times New Roman" w:hAnsi="Arial" w:cs="Arial"/>
+                <w:kern w:val="0"/>
+                <w:sz w:val="20"/>
+                <w:szCs w:val="20"/>
+                <w14:ligatures w14:val="none"/>
+              </w:rPr>
+              <w:t>Lingkungan</w:t>
+            </w:r>
+            <w:proofErr w:type="spellEnd"/>
           </w:p>
         </w:tc>
         <w:tc>
@@ -2337,8 +3313,42 @@
                 <w:szCs w:val="20"/>
                 <w14:ligatures w14:val="none"/>
               </w:rPr>
-              <w:t>Peta Tapak Proyek</w:t>
-            </w:r>
+              <w:t xml:space="preserve">Peta </w:t>
+            </w:r>
+            <w:proofErr w:type="spellStart"/>
+            <w:r>
+              <w:rPr>
+                <w:rFonts w:ascii="Arial" w:eastAsia="Times New Roman" w:hAnsi="Arial" w:cs="Arial"/>
+                <w:kern w:val="0"/>
+                <w:sz w:val="20"/>
+                <w:szCs w:val="20"/>
+                <w14:ligatures w14:val="none"/>
+              </w:rPr>
+              <w:t>Tapak</w:t>
+            </w:r>
+            <w:proofErr w:type="spellEnd"/>
+            <w:r>
+              <w:rPr>
+                <w:rFonts w:ascii="Arial" w:eastAsia="Times New Roman" w:hAnsi="Arial" w:cs="Arial"/>
+                <w:kern w:val="0"/>
+                <w:sz w:val="20"/>
+                <w:szCs w:val="20"/>
+                <w14:ligatures w14:val="none"/>
+              </w:rPr>
+              <w:t xml:space="preserve"> </w:t>
+            </w:r>
+            <w:proofErr w:type="spellStart"/>
+            <w:r>
+              <w:rPr>
+                <w:rFonts w:ascii="Arial" w:eastAsia="Times New Roman" w:hAnsi="Arial" w:cs="Arial"/>
+                <w:kern w:val="0"/>
+                <w:sz w:val="20"/>
+                <w:szCs w:val="20"/>
+                <w14:ligatures w14:val="none"/>
+              </w:rPr>
+              <w:t>Proyek</w:t>
+            </w:r>
+            <w:proofErr w:type="spellEnd"/>
           </w:p>
         </w:tc>
         <w:tc>
@@ -2608,8 +3618,20 @@
                 <w:szCs w:val="20"/>
                 <w14:ligatures w14:val="none"/>
               </w:rPr>
-              <w:t>Peta Pengelolaan</w:t>
-            </w:r>
+              <w:t xml:space="preserve">Peta </w:t>
+            </w:r>
+            <w:proofErr w:type="spellStart"/>
+            <w:r>
+              <w:rPr>
+                <w:rFonts w:ascii="Arial" w:eastAsia="Times New Roman" w:hAnsi="Arial" w:cs="Arial"/>
+                <w:kern w:val="0"/>
+                <w:sz w:val="20"/>
+                <w:szCs w:val="20"/>
+                <w14:ligatures w14:val="none"/>
+              </w:rPr>
+              <w:t>Pengelolaan</w:t>
+            </w:r>
+            <w:proofErr w:type="spellEnd"/>
             <w:r>
               <w:rPr>
                 <w:rFonts w:ascii="Arial" w:eastAsia="Times New Roman" w:hAnsi="Arial" w:cs="Arial"/>
@@ -2620,16 +3642,40 @@
               </w:rPr>
               <w:t xml:space="preserve"> dan </w:t>
             </w:r>
-            <w:r>
-              <w:rPr>
-                <w:rFonts w:ascii="Arial" w:eastAsia="Times New Roman" w:hAnsi="Arial" w:cs="Arial"/>
-                <w:kern w:val="0"/>
-                <w:sz w:val="20"/>
-                <w:szCs w:val="20"/>
-                <w14:ligatures w14:val="none"/>
-              </w:rPr>
-              <w:t>Pemantauan Lingkungan</w:t>
-            </w:r>
+            <w:proofErr w:type="spellStart"/>
+            <w:r>
+              <w:rPr>
+                <w:rFonts w:ascii="Arial" w:eastAsia="Times New Roman" w:hAnsi="Arial" w:cs="Arial"/>
+                <w:kern w:val="0"/>
+                <w:sz w:val="20"/>
+                <w:szCs w:val="20"/>
+                <w14:ligatures w14:val="none"/>
+              </w:rPr>
+              <w:t>Pemantauan</w:t>
+            </w:r>
+            <w:proofErr w:type="spellEnd"/>
+            <w:r>
+              <w:rPr>
+                <w:rFonts w:ascii="Arial" w:eastAsia="Times New Roman" w:hAnsi="Arial" w:cs="Arial"/>
+                <w:kern w:val="0"/>
+                <w:sz w:val="20"/>
+                <w:szCs w:val="20"/>
+                <w14:ligatures w14:val="none"/>
+              </w:rPr>
+              <w:t xml:space="preserve"> </w:t>
+            </w:r>
+            <w:proofErr w:type="spellStart"/>
+            <w:r>
+              <w:rPr>
+                <w:rFonts w:ascii="Arial" w:eastAsia="Times New Roman" w:hAnsi="Arial" w:cs="Arial"/>
+                <w:kern w:val="0"/>
+                <w:sz w:val="20"/>
+                <w:szCs w:val="20"/>
+                <w14:ligatures w14:val="none"/>
+              </w:rPr>
+              <w:t>Lingkungan</w:t>
+            </w:r>
+            <w:proofErr w:type="spellEnd"/>
           </w:p>
         </w:tc>
         <w:tc>
@@ -2891,15 +3937,27 @@
               </w:rPr>
               <w:t xml:space="preserve">Peta </w:t>
             </w:r>
-            <w:r>
-              <w:rPr>
-                <w:rFonts w:ascii="Arial" w:eastAsia="Times New Roman" w:hAnsi="Arial" w:cs="Arial"/>
-                <w:kern w:val="0"/>
-                <w:sz w:val="20"/>
-                <w:szCs w:val="20"/>
-                <w14:ligatures w14:val="none"/>
-              </w:rPr>
-              <w:t>Siteplan di A3</w:t>
+            <w:proofErr w:type="spellStart"/>
+            <w:r>
+              <w:rPr>
+                <w:rFonts w:ascii="Arial" w:eastAsia="Times New Roman" w:hAnsi="Arial" w:cs="Arial"/>
+                <w:kern w:val="0"/>
+                <w:sz w:val="20"/>
+                <w:szCs w:val="20"/>
+                <w14:ligatures w14:val="none"/>
+              </w:rPr>
+              <w:t>Siteplan</w:t>
+            </w:r>
+            <w:proofErr w:type="spellEnd"/>
+            <w:r>
+              <w:rPr>
+                <w:rFonts w:ascii="Arial" w:eastAsia="Times New Roman" w:hAnsi="Arial" w:cs="Arial"/>
+                <w:kern w:val="0"/>
+                <w:sz w:val="20"/>
+                <w:szCs w:val="20"/>
+                <w14:ligatures w14:val="none"/>
+              </w:rPr>
+              <w:t xml:space="preserve"> di A3</w:t>
             </w:r>
           </w:p>
         </w:tc>
@@ -3671,15 +4729,71 @@
                 <w14:ligatures w14:val="none"/>
               </w:rPr>
             </w:pPr>
-            <w:r>
-              <w:rPr>
-                <w:rFonts w:ascii="Arial" w:eastAsia="Times New Roman" w:hAnsi="Arial" w:cs="Arial"/>
-                <w:kern w:val="0"/>
-                <w:sz w:val="20"/>
-                <w:szCs w:val="20"/>
-                <w14:ligatures w14:val="none"/>
-              </w:rPr>
-              <w:t>Fotocopy Status Lahan (Sertifikat)</w:t>
+            <w:proofErr w:type="spellStart"/>
+            <w:r>
+              <w:rPr>
+                <w:rFonts w:ascii="Arial" w:eastAsia="Times New Roman" w:hAnsi="Arial" w:cs="Arial"/>
+                <w:kern w:val="0"/>
+                <w:sz w:val="20"/>
+                <w:szCs w:val="20"/>
+                <w14:ligatures w14:val="none"/>
+              </w:rPr>
+              <w:t>Fotocopy</w:t>
+            </w:r>
+            <w:proofErr w:type="spellEnd"/>
+            <w:r>
+              <w:rPr>
+                <w:rFonts w:ascii="Arial" w:eastAsia="Times New Roman" w:hAnsi="Arial" w:cs="Arial"/>
+                <w:kern w:val="0"/>
+                <w:sz w:val="20"/>
+                <w:szCs w:val="20"/>
+                <w14:ligatures w14:val="none"/>
+              </w:rPr>
+              <w:t xml:space="preserve"> Status </w:t>
+            </w:r>
+            <w:proofErr w:type="spellStart"/>
+            <w:r>
+              <w:rPr>
+                <w:rFonts w:ascii="Arial" w:eastAsia="Times New Roman" w:hAnsi="Arial" w:cs="Arial"/>
+                <w:kern w:val="0"/>
+                <w:sz w:val="20"/>
+                <w:szCs w:val="20"/>
+                <w14:ligatures w14:val="none"/>
+              </w:rPr>
+              <w:t>Lahan</w:t>
+            </w:r>
+            <w:proofErr w:type="spellEnd"/>
+            <w:r>
+              <w:rPr>
+                <w:rFonts w:ascii="Arial" w:eastAsia="Times New Roman" w:hAnsi="Arial" w:cs="Arial"/>
+                <w:kern w:val="0"/>
+                <w:sz w:val="20"/>
+                <w:szCs w:val="20"/>
+                <w14:ligatures w14:val="none"/>
+              </w:rPr>
+              <w:t xml:space="preserve"> (</w:t>
+            </w:r>
+            <w:proofErr w:type="spellStart"/>
+            <w:r>
+              <w:rPr>
+                <w:rFonts w:ascii="Arial" w:eastAsia="Times New Roman" w:hAnsi="Arial" w:cs="Arial"/>
+                <w:kern w:val="0"/>
+                <w:sz w:val="20"/>
+                <w:szCs w:val="20"/>
+                <w14:ligatures w14:val="none"/>
+              </w:rPr>
+              <w:t>Sertifikat</w:t>
+            </w:r>
+            <w:proofErr w:type="spellEnd"/>
+            <w:r>
+              <w:rPr>
+                <w:rFonts w:ascii="Arial" w:eastAsia="Times New Roman" w:hAnsi="Arial" w:cs="Arial"/>
+                <w:kern w:val="0"/>
+                <w:sz w:val="20"/>
+                <w:szCs w:val="20"/>
+                <w14:ligatures w14:val="none"/>
+              </w:rPr>
+              <w:t>)</w:t>
             </w:r>
           </w:p>
         </w:tc>
@@ -3931,15 +5045,71 @@
                 <w14:ligatures w14:val="none"/>
               </w:rPr>
             </w:pPr>
-            <w:r>
-              <w:rPr>
-                <w:rFonts w:ascii="Arial" w:eastAsia="Times New Roman" w:hAnsi="Arial" w:cs="Arial"/>
-                <w:kern w:val="0"/>
-                <w:sz w:val="20"/>
-                <w:szCs w:val="20"/>
-                <w14:ligatures w14:val="none"/>
-              </w:rPr>
-              <w:t xml:space="preserve">Fotocopy KTP Penanggungjawab Kegiatan </w:t>
+            <w:proofErr w:type="spellStart"/>
+            <w:r>
+              <w:rPr>
+                <w:rFonts w:ascii="Arial" w:eastAsia="Times New Roman" w:hAnsi="Arial" w:cs="Arial"/>
+                <w:kern w:val="0"/>
+                <w:sz w:val="20"/>
+                <w:szCs w:val="20"/>
+                <w14:ligatures w14:val="none"/>
+              </w:rPr>
+              <w:t>Fotocopy</w:t>
+            </w:r>
+            <w:proofErr w:type="spellEnd"/>
+            <w:r>
+              <w:rPr>
+                <w:rFonts w:ascii="Arial" w:eastAsia="Times New Roman" w:hAnsi="Arial" w:cs="Arial"/>
+                <w:kern w:val="0"/>
+                <w:sz w:val="20"/>
+                <w:szCs w:val="20"/>
+                <w14:ligatures w14:val="none"/>
+              </w:rPr>
+              <w:t xml:space="preserve"> KTP </w:t>
+            </w:r>
+            <w:proofErr w:type="spellStart"/>
+            <w:r>
+              <w:rPr>
+                <w:rFonts w:ascii="Arial" w:eastAsia="Times New Roman" w:hAnsi="Arial" w:cs="Arial"/>
+                <w:kern w:val="0"/>
+                <w:sz w:val="20"/>
+                <w:szCs w:val="20"/>
+                <w14:ligatures w14:val="none"/>
+              </w:rPr>
+              <w:t>Penanggungjawab</w:t>
+            </w:r>
+            <w:proofErr w:type="spellEnd"/>
+            <w:r>
+              <w:rPr>
+                <w:rFonts w:ascii="Arial" w:eastAsia="Times New Roman" w:hAnsi="Arial" w:cs="Arial"/>
+                <w:kern w:val="0"/>
+                <w:sz w:val="20"/>
+                <w:szCs w:val="20"/>
+                <w14:ligatures w14:val="none"/>
+              </w:rPr>
+              <w:t xml:space="preserve"> </w:t>
+            </w:r>
+            <w:proofErr w:type="spellStart"/>
+            <w:r>
+              <w:rPr>
+                <w:rFonts w:ascii="Arial" w:eastAsia="Times New Roman" w:hAnsi="Arial" w:cs="Arial"/>
+                <w:kern w:val="0"/>
+                <w:sz w:val="20"/>
+                <w:szCs w:val="20"/>
+                <w14:ligatures w14:val="none"/>
+              </w:rPr>
+              <w:t>Kegiatan</w:t>
+            </w:r>
+            <w:proofErr w:type="spellEnd"/>
+            <w:r>
+              <w:rPr>
+                <w:rFonts w:ascii="Arial" w:eastAsia="Times New Roman" w:hAnsi="Arial" w:cs="Arial"/>
+                <w:kern w:val="0"/>
+                <w:sz w:val="20"/>
+                <w:szCs w:val="20"/>
+                <w14:ligatures w14:val="none"/>
+              </w:rPr>
+              <w:t xml:space="preserve"> </w:t>
             </w:r>
           </w:p>
         </w:tc>
@@ -4199,8 +5369,152 @@
                 <w:szCs w:val="20"/>
                 <w14:ligatures w14:val="none"/>
               </w:rPr>
-              <w:t>Foto Eksisting Lokasi Rencana Kegiatan Disertai dengan Titik Koordinat</w:t>
-            </w:r>
+              <w:t xml:space="preserve">Foto </w:t>
+            </w:r>
+            <w:proofErr w:type="spellStart"/>
+            <w:r>
+              <w:rPr>
+                <w:rFonts w:ascii="Arial" w:eastAsia="Times New Roman" w:hAnsi="Arial" w:cs="Arial"/>
+                <w:kern w:val="0"/>
+                <w:sz w:val="20"/>
+                <w:szCs w:val="20"/>
+                <w14:ligatures w14:val="none"/>
+              </w:rPr>
+              <w:t>Eksisting</w:t>
+            </w:r>
+            <w:proofErr w:type="spellEnd"/>
+            <w:r>
+              <w:rPr>
+                <w:rFonts w:ascii="Arial" w:eastAsia="Times New Roman" w:hAnsi="Arial" w:cs="Arial"/>
+                <w:kern w:val="0"/>
+                <w:sz w:val="20"/>
+                <w:szCs w:val="20"/>
+                <w14:ligatures w14:val="none"/>
+              </w:rPr>
+              <w:t xml:space="preserve"> Lokasi </w:t>
+            </w:r>
+            <w:proofErr w:type="spellStart"/>
+            <w:r>
+              <w:rPr>
+                <w:rFonts w:ascii="Arial" w:eastAsia="Times New Roman" w:hAnsi="Arial" w:cs="Arial"/>
+                <w:kern w:val="0"/>
+                <w:sz w:val="20"/>
+                <w:szCs w:val="20"/>
+                <w14:ligatures w14:val="none"/>
+              </w:rPr>
+              <w:t>Rencana</w:t>
+            </w:r>
+            <w:proofErr w:type="spellEnd"/>
+            <w:r>
+              <w:rPr>
+                <w:rFonts w:ascii="Arial" w:eastAsia="Times New Roman" w:hAnsi="Arial" w:cs="Arial"/>
+                <w:kern w:val="0"/>
+                <w:sz w:val="20"/>
+                <w:szCs w:val="20"/>
+                <w14:ligatures w14:val="none"/>
+              </w:rPr>
+              <w:t xml:space="preserve"> </w:t>
+            </w:r>
+            <w:proofErr w:type="spellStart"/>
+            <w:r>
+              <w:rPr>
+                <w:rFonts w:ascii="Arial" w:eastAsia="Times New Roman" w:hAnsi="Arial" w:cs="Arial"/>
+                <w:kern w:val="0"/>
+                <w:sz w:val="20"/>
+                <w:szCs w:val="20"/>
+                <w14:ligatures w14:val="none"/>
+              </w:rPr>
+              <w:t>Kegiatan</w:t>
+            </w:r>
+            <w:proofErr w:type="spellEnd"/>
+            <w:r>
+              <w:rPr>
+                <w:rFonts w:ascii="Arial" w:eastAsia="Times New Roman" w:hAnsi="Arial" w:cs="Arial"/>
+                <w:kern w:val="0"/>
+                <w:sz w:val="20"/>
+                <w:szCs w:val="20"/>
+                <w14:ligatures w14:val="none"/>
+              </w:rPr>
+              <w:t xml:space="preserve"> </w:t>
+            </w:r>
+            <w:proofErr w:type="spellStart"/>
+            <w:r>
+              <w:rPr>
+                <w:rFonts w:ascii="Arial" w:eastAsia="Times New Roman" w:hAnsi="Arial" w:cs="Arial"/>
+                <w:kern w:val="0"/>
+                <w:sz w:val="20"/>
+                <w:szCs w:val="20"/>
+                <w14:ligatures w14:val="none"/>
+              </w:rPr>
+              <w:t>Disertai</w:t>
+            </w:r>
+            <w:proofErr w:type="spellEnd"/>
+            <w:r>
+              <w:rPr>
+                <w:rFonts w:ascii="Arial" w:eastAsia="Times New Roman" w:hAnsi="Arial" w:cs="Arial"/>
+                <w:kern w:val="0"/>
+                <w:sz w:val="20"/>
+                <w:szCs w:val="20"/>
+                <w14:ligatures w14:val="none"/>
+              </w:rPr>
+              <w:t xml:space="preserve"> </w:t>
+            </w:r>
+            <w:proofErr w:type="spellStart"/>
+            <w:r>
+              <w:rPr>
+                <w:rFonts w:ascii="Arial" w:eastAsia="Times New Roman" w:hAnsi="Arial" w:cs="Arial"/>
+                <w:kern w:val="0"/>
+                <w:sz w:val="20"/>
+                <w:szCs w:val="20"/>
+                <w14:ligatures w14:val="none"/>
+              </w:rPr>
+              <w:t>dengan</w:t>
+            </w:r>
+            <w:proofErr w:type="spellEnd"/>
+            <w:r>
+              <w:rPr>
+                <w:rFonts w:ascii="Arial" w:eastAsia="Times New Roman" w:hAnsi="Arial" w:cs="Arial"/>
+                <w:kern w:val="0"/>
+                <w:sz w:val="20"/>
+                <w:szCs w:val="20"/>
+                <w14:ligatures w14:val="none"/>
+              </w:rPr>
+              <w:t xml:space="preserve"> </w:t>
+            </w:r>
+            <w:proofErr w:type="spellStart"/>
+            <w:r>
+              <w:rPr>
+                <w:rFonts w:ascii="Arial" w:eastAsia="Times New Roman" w:hAnsi="Arial" w:cs="Arial"/>
+                <w:kern w:val="0"/>
+                <w:sz w:val="20"/>
+                <w:szCs w:val="20"/>
+                <w14:ligatures w14:val="none"/>
+              </w:rPr>
+              <w:t>Titik</w:t>
+            </w:r>
+            <w:proofErr w:type="spellEnd"/>
+            <w:r>
+              <w:rPr>
+                <w:rFonts w:ascii="Arial" w:eastAsia="Times New Roman" w:hAnsi="Arial" w:cs="Arial"/>
+                <w:kern w:val="0"/>
+                <w:sz w:val="20"/>
+                <w:szCs w:val="20"/>
+                <w14:ligatures w14:val="none"/>
+              </w:rPr>
+              <w:t xml:space="preserve"> </w:t>
+            </w:r>
+            <w:proofErr w:type="spellStart"/>
+            <w:r>
+              <w:rPr>
+                <w:rFonts w:ascii="Arial" w:eastAsia="Times New Roman" w:hAnsi="Arial" w:cs="Arial"/>
+                <w:kern w:val="0"/>
+                <w:sz w:val="20"/>
+                <w:szCs w:val="20"/>
+                <w14:ligatures w14:val="none"/>
+              </w:rPr>
+              <w:t>Koordinat</w:t>
+            </w:r>
+            <w:proofErr w:type="spellEnd"/>
           </w:p>
         </w:tc>
         <w:tc>
@@ -4461,7 +5775,51 @@
                 <w:szCs w:val="20"/>
                 <w14:ligatures w14:val="none"/>
               </w:rPr>
-              <w:t xml:space="preserve">Lembar Penapisan dari AMDALNET (https://amdalnet.menlhk.go.id/) </w:t>
+              <w:t xml:space="preserve">Lembar </w:t>
+            </w:r>
+            <w:proofErr w:type="spellStart"/>
+            <w:r>
+              <w:rPr>
+                <w:rFonts w:ascii="Arial" w:eastAsia="Times New Roman" w:hAnsi="Arial" w:cs="Arial"/>
+                <w:kern w:val="0"/>
+                <w:sz w:val="20"/>
+                <w:szCs w:val="20"/>
+                <w14:ligatures w14:val="none"/>
+              </w:rPr>
+              <w:t>Penapisan</w:t>
+            </w:r>
+            <w:proofErr w:type="spellEnd"/>
+            <w:r>
+              <w:rPr>
+                <w:rFonts w:ascii="Arial" w:eastAsia="Times New Roman" w:hAnsi="Arial" w:cs="Arial"/>
+                <w:kern w:val="0"/>
+                <w:sz w:val="20"/>
+                <w:szCs w:val="20"/>
+                <w14:ligatures w14:val="none"/>
+              </w:rPr>
+              <w:t xml:space="preserve"> </w:t>
+            </w:r>
+            <w:proofErr w:type="spellStart"/>
+            <w:r>
+              <w:rPr>
+                <w:rFonts w:ascii="Arial" w:eastAsia="Times New Roman" w:hAnsi="Arial" w:cs="Arial"/>
+                <w:kern w:val="0"/>
+                <w:sz w:val="20"/>
+                <w:szCs w:val="20"/>
+                <w14:ligatures w14:val="none"/>
+              </w:rPr>
+              <w:t>dari</w:t>
+            </w:r>
+            <w:proofErr w:type="spellEnd"/>
+            <w:r>
+              <w:rPr>
+                <w:rFonts w:ascii="Arial" w:eastAsia="Times New Roman" w:hAnsi="Arial" w:cs="Arial"/>
+                <w:kern w:val="0"/>
+                <w:sz w:val="20"/>
+                <w:szCs w:val="20"/>
+                <w14:ligatures w14:val="none"/>
+              </w:rPr>
+              <w:t xml:space="preserve"> AMDALNET (https://amdalnet.menlhk.go.id/) </w:t>
             </w:r>
             <w:r>
               <w:rPr>
@@ -4472,7 +5830,95 @@
                 <w14:ligatures w14:val="none"/>
               </w:rPr>
               <w:br/>
-              <w:t>(Nomor Registrasi / Penapisan Otomatis)</w:t>
+              <w:t>(</w:t>
+            </w:r>
+            <w:proofErr w:type="spellStart"/>
+            <w:r>
+              <w:rPr>
+                <w:rFonts w:ascii="Arial" w:eastAsia="Times New Roman" w:hAnsi="Arial" w:cs="Arial"/>
+                <w:kern w:val="0"/>
+                <w:sz w:val="20"/>
+                <w:szCs w:val="20"/>
+                <w14:ligatures w14:val="none"/>
+              </w:rPr>
+              <w:t>Nomor</w:t>
+            </w:r>
+            <w:proofErr w:type="spellEnd"/>
+            <w:r>
+              <w:rPr>
+                <w:rFonts w:ascii="Arial" w:eastAsia="Times New Roman" w:hAnsi="Arial" w:cs="Arial"/>
+                <w:kern w:val="0"/>
+                <w:sz w:val="20"/>
+                <w:szCs w:val="20"/>
+                <w14:ligatures w14:val="none"/>
+              </w:rPr>
+              <w:t xml:space="preserve"> </w:t>
+            </w:r>
+            <w:proofErr w:type="spellStart"/>
+            <w:r>
+              <w:rPr>
+                <w:rFonts w:ascii="Arial" w:eastAsia="Times New Roman" w:hAnsi="Arial" w:cs="Arial"/>
+                <w:kern w:val="0"/>
+                <w:sz w:val="20"/>
+                <w:szCs w:val="20"/>
+                <w14:ligatures w14:val="none"/>
+              </w:rPr>
+              <w:t>Registrasi</w:t>
+            </w:r>
+            <w:proofErr w:type="spellEnd"/>
+            <w:r>
+              <w:rPr>
+                <w:rFonts w:ascii="Arial" w:eastAsia="Times New Roman" w:hAnsi="Arial" w:cs="Arial"/>
+                <w:kern w:val="0"/>
+                <w:sz w:val="20"/>
+                <w:szCs w:val="20"/>
+                <w14:ligatures w14:val="none"/>
+              </w:rPr>
+              <w:t xml:space="preserve"> / </w:t>
+            </w:r>
+            <w:proofErr w:type="spellStart"/>
+            <w:r>
+              <w:rPr>
+                <w:rFonts w:ascii="Arial" w:eastAsia="Times New Roman" w:hAnsi="Arial" w:cs="Arial"/>
+                <w:kern w:val="0"/>
+                <w:sz w:val="20"/>
+                <w:szCs w:val="20"/>
+                <w14:ligatures w14:val="none"/>
+              </w:rPr>
+              <w:t>Penapisan</w:t>
+            </w:r>
+            <w:proofErr w:type="spellEnd"/>
+            <w:r>
+              <w:rPr>
+                <w:rFonts w:ascii="Arial" w:eastAsia="Times New Roman" w:hAnsi="Arial" w:cs="Arial"/>
+                <w:kern w:val="0"/>
+                <w:sz w:val="20"/>
+                <w:szCs w:val="20"/>
+                <w14:ligatures w14:val="none"/>
+              </w:rPr>
+              <w:t xml:space="preserve"> </w:t>
+            </w:r>
+            <w:proofErr w:type="spellStart"/>
+            <w:r>
+              <w:rPr>
+                <w:rFonts w:ascii="Arial" w:eastAsia="Times New Roman" w:hAnsi="Arial" w:cs="Arial"/>
+                <w:kern w:val="0"/>
+                <w:sz w:val="20"/>
+                <w:szCs w:val="20"/>
+                <w14:ligatures w14:val="none"/>
+              </w:rPr>
+              <w:t>Otomatis</w:t>
+            </w:r>
+            <w:proofErr w:type="spellEnd"/>
+            <w:r>
+              <w:rPr>
+                <w:rFonts w:ascii="Arial" w:eastAsia="Times New Roman" w:hAnsi="Arial" w:cs="Arial"/>
+                <w:kern w:val="0"/>
+                <w:sz w:val="20"/>
+                <w:szCs w:val="20"/>
+                <w14:ligatures w14:val="none"/>
+              </w:rPr>
+              <w:t>)</w:t>
             </w:r>
           </w:p>
         </w:tc>
@@ -4733,7 +6179,139 @@
                 <w:szCs w:val="20"/>
                 <w14:ligatures w14:val="none"/>
               </w:rPr>
-              <w:t>Surat Kuasa Pekerjaan dari Pemrakarsa ke Konsultan (Bermaterai)</w:t>
+              <w:t xml:space="preserve">Surat Kuasa </w:t>
+            </w:r>
+            <w:proofErr w:type="spellStart"/>
+            <w:r>
+              <w:rPr>
+                <w:rFonts w:ascii="Arial" w:eastAsia="Times New Roman" w:hAnsi="Arial" w:cs="Arial"/>
+                <w:kern w:val="0"/>
+                <w:sz w:val="20"/>
+                <w:szCs w:val="20"/>
+                <w14:ligatures w14:val="none"/>
+              </w:rPr>
+              <w:t>Pekerjaan</w:t>
+            </w:r>
+            <w:proofErr w:type="spellEnd"/>
+            <w:r>
+              <w:rPr>
+                <w:rFonts w:ascii="Arial" w:eastAsia="Times New Roman" w:hAnsi="Arial" w:cs="Arial"/>
+                <w:kern w:val="0"/>
+                <w:sz w:val="20"/>
+                <w:szCs w:val="20"/>
+                <w14:ligatures w14:val="none"/>
+              </w:rPr>
+              <w:t xml:space="preserve"> </w:t>
+            </w:r>
+            <w:proofErr w:type="spellStart"/>
+            <w:r>
+              <w:rPr>
+                <w:rFonts w:ascii="Arial" w:eastAsia="Times New Roman" w:hAnsi="Arial" w:cs="Arial"/>
+                <w:kern w:val="0"/>
+                <w:sz w:val="20"/>
+                <w:szCs w:val="20"/>
+                <w14:ligatures w14:val="none"/>
+              </w:rPr>
+              <w:t>dari</w:t>
+            </w:r>
+            <w:proofErr w:type="spellEnd"/>
+            <w:r>
+              <w:rPr>
+                <w:rFonts w:ascii="Arial" w:eastAsia="Times New Roman" w:hAnsi="Arial" w:cs="Arial"/>
+                <w:kern w:val="0"/>
+                <w:sz w:val="20"/>
+                <w:szCs w:val="20"/>
+                <w14:ligatures w14:val="none"/>
+              </w:rPr>
+              <w:t xml:space="preserve"> </w:t>
+            </w:r>
+            <w:proofErr w:type="spellStart"/>
+            <w:r>
+              <w:rPr>
+                <w:rFonts w:ascii="Arial" w:eastAsia="Times New Roman" w:hAnsi="Arial" w:cs="Arial"/>
+                <w:kern w:val="0"/>
+                <w:sz w:val="20"/>
+                <w:szCs w:val="20"/>
+                <w14:ligatures w14:val="none"/>
+              </w:rPr>
+              <w:t>Pemrakarsa</w:t>
+            </w:r>
+            <w:proofErr w:type="spellEnd"/>
+            <w:r>
+              <w:rPr>
+                <w:rFonts w:ascii="Arial" w:eastAsia="Times New Roman" w:hAnsi="Arial" w:cs="Arial"/>
+                <w:kern w:val="0"/>
+                <w:sz w:val="20"/>
+                <w:szCs w:val="20"/>
+                <w14:ligatures w14:val="none"/>
+              </w:rPr>
+              <w:t xml:space="preserve"> </w:t>
+            </w:r>
+            <w:proofErr w:type="spellStart"/>
+            <w:r>
+              <w:rPr>
+                <w:rFonts w:ascii="Arial" w:eastAsia="Times New Roman" w:hAnsi="Arial" w:cs="Arial"/>
+                <w:kern w:val="0"/>
+                <w:sz w:val="20"/>
+                <w:szCs w:val="20"/>
+                <w14:ligatures w14:val="none"/>
+              </w:rPr>
+              <w:t>ke</w:t>
+            </w:r>
+            <w:proofErr w:type="spellEnd"/>
+            <w:r>
+              <w:rPr>
+                <w:rFonts w:ascii="Arial" w:eastAsia="Times New Roman" w:hAnsi="Arial" w:cs="Arial"/>
+                <w:kern w:val="0"/>
+                <w:sz w:val="20"/>
+                <w:szCs w:val="20"/>
+                <w14:ligatures w14:val="none"/>
+              </w:rPr>
+              <w:t xml:space="preserve"> </w:t>
+            </w:r>
+            <w:proofErr w:type="spellStart"/>
+            <w:r>
+              <w:rPr>
+                <w:rFonts w:ascii="Arial" w:eastAsia="Times New Roman" w:hAnsi="Arial" w:cs="Arial"/>
+                <w:kern w:val="0"/>
+                <w:sz w:val="20"/>
+                <w:szCs w:val="20"/>
+                <w14:ligatures w14:val="none"/>
+              </w:rPr>
+              <w:t>Konsultan</w:t>
+            </w:r>
+            <w:proofErr w:type="spellEnd"/>
+            <w:r>
+              <w:rPr>
+                <w:rFonts w:ascii="Arial" w:eastAsia="Times New Roman" w:hAnsi="Arial" w:cs="Arial"/>
+                <w:kern w:val="0"/>
+                <w:sz w:val="20"/>
+                <w:szCs w:val="20"/>
+                <w14:ligatures w14:val="none"/>
+              </w:rPr>
+              <w:t xml:space="preserve"> (</w:t>
+            </w:r>
+            <w:proofErr w:type="spellStart"/>
+            <w:r>
+              <w:rPr>
+                <w:rFonts w:ascii="Arial" w:eastAsia="Times New Roman" w:hAnsi="Arial" w:cs="Arial"/>
+                <w:kern w:val="0"/>
+                <w:sz w:val="20"/>
+                <w:szCs w:val="20"/>
+                <w14:ligatures w14:val="none"/>
+              </w:rPr>
+              <w:t>Bermaterai</w:t>
+            </w:r>
+            <w:proofErr w:type="spellEnd"/>
+            <w:r>
+              <w:rPr>
+                <w:rFonts w:ascii="Arial" w:eastAsia="Times New Roman" w:hAnsi="Arial" w:cs="Arial"/>
+                <w:kern w:val="0"/>
+                <w:sz w:val="20"/>
+                <w:szCs w:val="20"/>
+                <w14:ligatures w14:val="none"/>
+              </w:rPr>
+              <w:t>)</w:t>
             </w:r>
           </w:p>
         </w:tc>
@@ -4996,15 +6574,115 @@
                 <w14:ligatures w14:val="none"/>
               </w:rPr>
             </w:pPr>
-            <w:r>
-              <w:rPr>
-                <w:rFonts w:ascii="Arial" w:eastAsia="Times New Roman" w:hAnsi="Arial" w:cs="Arial"/>
-                <w:kern w:val="0"/>
-                <w:sz w:val="20"/>
-                <w:szCs w:val="20"/>
-                <w14:ligatures w14:val="none"/>
-              </w:rPr>
-              <w:t>Perizinan yang Sudah Dimiliki atau Izin yang Lama (Jika Ada)</w:t>
+            <w:proofErr w:type="spellStart"/>
+            <w:r>
+              <w:rPr>
+                <w:rFonts w:ascii="Arial" w:eastAsia="Times New Roman" w:hAnsi="Arial" w:cs="Arial"/>
+                <w:kern w:val="0"/>
+                <w:sz w:val="20"/>
+                <w:szCs w:val="20"/>
+                <w14:ligatures w14:val="none"/>
+              </w:rPr>
+              <w:t>Perizinan</w:t>
+            </w:r>
+            <w:proofErr w:type="spellEnd"/>
+            <w:r>
+              <w:rPr>
+                <w:rFonts w:ascii="Arial" w:eastAsia="Times New Roman" w:hAnsi="Arial" w:cs="Arial"/>
+                <w:kern w:val="0"/>
+                <w:sz w:val="20"/>
+                <w:szCs w:val="20"/>
+                <w14:ligatures w14:val="none"/>
+              </w:rPr>
+              <w:t xml:space="preserve"> yang </w:t>
+            </w:r>
+            <w:proofErr w:type="spellStart"/>
+            <w:r>
+              <w:rPr>
+                <w:rFonts w:ascii="Arial" w:eastAsia="Times New Roman" w:hAnsi="Arial" w:cs="Arial"/>
+                <w:kern w:val="0"/>
+                <w:sz w:val="20"/>
+                <w:szCs w:val="20"/>
+                <w14:ligatures w14:val="none"/>
+              </w:rPr>
+              <w:t>Sudah</w:t>
+            </w:r>
+            <w:proofErr w:type="spellEnd"/>
+            <w:r>
+              <w:rPr>
+                <w:rFonts w:ascii="Arial" w:eastAsia="Times New Roman" w:hAnsi="Arial" w:cs="Arial"/>
+                <w:kern w:val="0"/>
+                <w:sz w:val="20"/>
+                <w:szCs w:val="20"/>
+                <w14:ligatures w14:val="none"/>
+              </w:rPr>
+              <w:t xml:space="preserve"> </w:t>
+            </w:r>
+            <w:proofErr w:type="spellStart"/>
+            <w:r>
+              <w:rPr>
+                <w:rFonts w:ascii="Arial" w:eastAsia="Times New Roman" w:hAnsi="Arial" w:cs="Arial"/>
+                <w:kern w:val="0"/>
+                <w:sz w:val="20"/>
+                <w:szCs w:val="20"/>
+                <w14:ligatures w14:val="none"/>
+              </w:rPr>
+              <w:t>Dimiliki</w:t>
+            </w:r>
+            <w:proofErr w:type="spellEnd"/>
+            <w:r>
+              <w:rPr>
+                <w:rFonts w:ascii="Arial" w:eastAsia="Times New Roman" w:hAnsi="Arial" w:cs="Arial"/>
+                <w:kern w:val="0"/>
+                <w:sz w:val="20"/>
+                <w:szCs w:val="20"/>
+                <w14:ligatures w14:val="none"/>
+              </w:rPr>
+              <w:t xml:space="preserve"> </w:t>
+            </w:r>
+            <w:proofErr w:type="spellStart"/>
+            <w:r>
+              <w:rPr>
+                <w:rFonts w:ascii="Arial" w:eastAsia="Times New Roman" w:hAnsi="Arial" w:cs="Arial"/>
+                <w:kern w:val="0"/>
+                <w:sz w:val="20"/>
+                <w:szCs w:val="20"/>
+                <w14:ligatures w14:val="none"/>
+              </w:rPr>
+              <w:t>atau</w:t>
+            </w:r>
+            <w:proofErr w:type="spellEnd"/>
+            <w:r>
+              <w:rPr>
+                <w:rFonts w:ascii="Arial" w:eastAsia="Times New Roman" w:hAnsi="Arial" w:cs="Arial"/>
+                <w:kern w:val="0"/>
+                <w:sz w:val="20"/>
+                <w:szCs w:val="20"/>
+                <w14:ligatures w14:val="none"/>
+              </w:rPr>
+              <w:t xml:space="preserve"> </w:t>
+            </w:r>
+            <w:proofErr w:type="spellStart"/>
+            <w:r>
+              <w:rPr>
+                <w:rFonts w:ascii="Arial" w:eastAsia="Times New Roman" w:hAnsi="Arial" w:cs="Arial"/>
+                <w:kern w:val="0"/>
+                <w:sz w:val="20"/>
+                <w:szCs w:val="20"/>
+                <w14:ligatures w14:val="none"/>
+              </w:rPr>
+              <w:t>Izin</w:t>
+            </w:r>
+            <w:proofErr w:type="spellEnd"/>
+            <w:r>
+              <w:rPr>
+                <w:rFonts w:ascii="Arial" w:eastAsia="Times New Roman" w:hAnsi="Arial" w:cs="Arial"/>
+                <w:kern w:val="0"/>
+                <w:sz w:val="20"/>
+                <w:szCs w:val="20"/>
+                <w14:ligatures w14:val="none"/>
+              </w:rPr>
+              <w:t xml:space="preserve"> yang Lama (Jika Ada)</w:t>
             </w:r>
           </w:p>
         </w:tc>
@@ -5267,16 +6945,62 @@
                 <w14:ligatures w14:val="none"/>
               </w:rPr>
             </w:pPr>
-            <w:r>
-              <w:rPr>
-                <w:rFonts w:ascii="Arial" w:eastAsia="Times New Roman" w:hAnsi="Arial" w:cs="Arial"/>
-                <w:kern w:val="0"/>
-                <w:sz w:val="20"/>
-                <w:szCs w:val="20"/>
-                <w14:ligatures w14:val="none"/>
-              </w:rPr>
-              <w:t>Pemenuhan Persetujuan Teknis Air Limbah</w:t>
-            </w:r>
+            <w:proofErr w:type="spellStart"/>
+            <w:r>
+              <w:rPr>
+                <w:rFonts w:ascii="Arial" w:eastAsia="Times New Roman" w:hAnsi="Arial" w:cs="Arial"/>
+                <w:kern w:val="0"/>
+                <w:sz w:val="20"/>
+                <w:szCs w:val="20"/>
+                <w14:ligatures w14:val="none"/>
+              </w:rPr>
+              <w:t>Pemenuhan</w:t>
+            </w:r>
+            <w:proofErr w:type="spellEnd"/>
+            <w:r>
+              <w:rPr>
+                <w:rFonts w:ascii="Arial" w:eastAsia="Times New Roman" w:hAnsi="Arial" w:cs="Arial"/>
+                <w:kern w:val="0"/>
+                <w:sz w:val="20"/>
+                <w:szCs w:val="20"/>
+                <w14:ligatures w14:val="none"/>
+              </w:rPr>
+              <w:t xml:space="preserve"> </w:t>
+            </w:r>
+            <w:proofErr w:type="spellStart"/>
+            <w:r>
+              <w:rPr>
+                <w:rFonts w:ascii="Arial" w:eastAsia="Times New Roman" w:hAnsi="Arial" w:cs="Arial"/>
+                <w:kern w:val="0"/>
+                <w:sz w:val="20"/>
+                <w:szCs w:val="20"/>
+                <w14:ligatures w14:val="none"/>
+              </w:rPr>
+              <w:t>Persetujuan</w:t>
+            </w:r>
+            <w:proofErr w:type="spellEnd"/>
+            <w:r>
+              <w:rPr>
+                <w:rFonts w:ascii="Arial" w:eastAsia="Times New Roman" w:hAnsi="Arial" w:cs="Arial"/>
+                <w:kern w:val="0"/>
+                <w:sz w:val="20"/>
+                <w:szCs w:val="20"/>
+                <w14:ligatures w14:val="none"/>
+              </w:rPr>
+              <w:t xml:space="preserve"> Teknis Air </w:t>
+            </w:r>
+            <w:proofErr w:type="spellStart"/>
+            <w:r>
+              <w:rPr>
+                <w:rFonts w:ascii="Arial" w:eastAsia="Times New Roman" w:hAnsi="Arial" w:cs="Arial"/>
+                <w:kern w:val="0"/>
+                <w:sz w:val="20"/>
+                <w:szCs w:val="20"/>
+                <w14:ligatures w14:val="none"/>
+              </w:rPr>
+              <w:t>Limbah</w:t>
+            </w:r>
+            <w:proofErr w:type="spellEnd"/>
           </w:p>
         </w:tc>
         <w:tc>
@@ -5537,16 +7261,84 @@
                 <w14:ligatures w14:val="none"/>
               </w:rPr>
             </w:pPr>
-            <w:r>
-              <w:rPr>
-                <w:rFonts w:ascii="Arial" w:eastAsia="Times New Roman" w:hAnsi="Arial" w:cs="Arial"/>
-                <w:kern w:val="0"/>
-                <w:sz w:val="20"/>
-                <w:szCs w:val="20"/>
-                <w14:ligatures w14:val="none"/>
-              </w:rPr>
-              <w:t>Pemenuhan Rincian Teknis Limbah B3 Sementara</w:t>
-            </w:r>
+            <w:proofErr w:type="spellStart"/>
+            <w:r>
+              <w:rPr>
+                <w:rFonts w:ascii="Arial" w:eastAsia="Times New Roman" w:hAnsi="Arial" w:cs="Arial"/>
+                <w:kern w:val="0"/>
+                <w:sz w:val="20"/>
+                <w:szCs w:val="20"/>
+                <w14:ligatures w14:val="none"/>
+              </w:rPr>
+              <w:t>Pemenuhan</w:t>
+            </w:r>
+            <w:proofErr w:type="spellEnd"/>
+            <w:r>
+              <w:rPr>
+                <w:rFonts w:ascii="Arial" w:eastAsia="Times New Roman" w:hAnsi="Arial" w:cs="Arial"/>
+                <w:kern w:val="0"/>
+                <w:sz w:val="20"/>
+                <w:szCs w:val="20"/>
+                <w14:ligatures w14:val="none"/>
+              </w:rPr>
+              <w:t xml:space="preserve"> </w:t>
+            </w:r>
+            <w:proofErr w:type="spellStart"/>
+            <w:r>
+              <w:rPr>
+                <w:rFonts w:ascii="Arial" w:eastAsia="Times New Roman" w:hAnsi="Arial" w:cs="Arial"/>
+                <w:kern w:val="0"/>
+                <w:sz w:val="20"/>
+                <w:szCs w:val="20"/>
+                <w14:ligatures w14:val="none"/>
+              </w:rPr>
+              <w:t>Rincian</w:t>
+            </w:r>
+            <w:proofErr w:type="spellEnd"/>
+            <w:r>
+              <w:rPr>
+                <w:rFonts w:ascii="Arial" w:eastAsia="Times New Roman" w:hAnsi="Arial" w:cs="Arial"/>
+                <w:kern w:val="0"/>
+                <w:sz w:val="20"/>
+                <w:szCs w:val="20"/>
+                <w14:ligatures w14:val="none"/>
+              </w:rPr>
+              <w:t xml:space="preserve"> Teknis </w:t>
+            </w:r>
+            <w:proofErr w:type="spellStart"/>
+            <w:r>
+              <w:rPr>
+                <w:rFonts w:ascii="Arial" w:eastAsia="Times New Roman" w:hAnsi="Arial" w:cs="Arial"/>
+                <w:kern w:val="0"/>
+                <w:sz w:val="20"/>
+                <w:szCs w:val="20"/>
+                <w14:ligatures w14:val="none"/>
+              </w:rPr>
+              <w:t>Limbah</w:t>
+            </w:r>
+            <w:proofErr w:type="spellEnd"/>
+            <w:r>
+              <w:rPr>
+                <w:rFonts w:ascii="Arial" w:eastAsia="Times New Roman" w:hAnsi="Arial" w:cs="Arial"/>
+                <w:kern w:val="0"/>
+                <w:sz w:val="20"/>
+                <w:szCs w:val="20"/>
+                <w14:ligatures w14:val="none"/>
+              </w:rPr>
+              <w:t xml:space="preserve"> B3 </w:t>
+            </w:r>
+            <w:proofErr w:type="spellStart"/>
+            <w:r>
+              <w:rPr>
+                <w:rFonts w:ascii="Arial" w:eastAsia="Times New Roman" w:hAnsi="Arial" w:cs="Arial"/>
+                <w:kern w:val="0"/>
+                <w:sz w:val="20"/>
+                <w:szCs w:val="20"/>
+                <w14:ligatures w14:val="none"/>
+              </w:rPr>
+              <w:t>Sementara</w:t>
+            </w:r>
+            <w:proofErr w:type="spellEnd"/>
           </w:p>
         </w:tc>
         <w:tc>
@@ -5807,16 +7599,62 @@
                 <w14:ligatures w14:val="none"/>
               </w:rPr>
             </w:pPr>
-            <w:r>
-              <w:rPr>
-                <w:rFonts w:ascii="Arial" w:eastAsia="Times New Roman" w:hAnsi="Arial" w:cs="Arial"/>
-                <w:kern w:val="0"/>
-                <w:sz w:val="20"/>
-                <w:szCs w:val="20"/>
-                <w14:ligatures w14:val="none"/>
-              </w:rPr>
-              <w:t>Pemenuhan Persetujuan Teknis Emisi</w:t>
-            </w:r>
+            <w:proofErr w:type="spellStart"/>
+            <w:r>
+              <w:rPr>
+                <w:rFonts w:ascii="Arial" w:eastAsia="Times New Roman" w:hAnsi="Arial" w:cs="Arial"/>
+                <w:kern w:val="0"/>
+                <w:sz w:val="20"/>
+                <w:szCs w:val="20"/>
+                <w14:ligatures w14:val="none"/>
+              </w:rPr>
+              <w:t>Pemenuhan</w:t>
+            </w:r>
+            <w:proofErr w:type="spellEnd"/>
+            <w:r>
+              <w:rPr>
+                <w:rFonts w:ascii="Arial" w:eastAsia="Times New Roman" w:hAnsi="Arial" w:cs="Arial"/>
+                <w:kern w:val="0"/>
+                <w:sz w:val="20"/>
+                <w:szCs w:val="20"/>
+                <w14:ligatures w14:val="none"/>
+              </w:rPr>
+              <w:t xml:space="preserve"> </w:t>
+            </w:r>
+            <w:proofErr w:type="spellStart"/>
+            <w:r>
+              <w:rPr>
+                <w:rFonts w:ascii="Arial" w:eastAsia="Times New Roman" w:hAnsi="Arial" w:cs="Arial"/>
+                <w:kern w:val="0"/>
+                <w:sz w:val="20"/>
+                <w:szCs w:val="20"/>
+                <w14:ligatures w14:val="none"/>
+              </w:rPr>
+              <w:t>Persetujuan</w:t>
+            </w:r>
+            <w:proofErr w:type="spellEnd"/>
+            <w:r>
+              <w:rPr>
+                <w:rFonts w:ascii="Arial" w:eastAsia="Times New Roman" w:hAnsi="Arial" w:cs="Arial"/>
+                <w:kern w:val="0"/>
+                <w:sz w:val="20"/>
+                <w:szCs w:val="20"/>
+                <w14:ligatures w14:val="none"/>
+              </w:rPr>
+              <w:t xml:space="preserve"> Teknis </w:t>
+            </w:r>
+            <w:proofErr w:type="spellStart"/>
+            <w:r>
+              <w:rPr>
+                <w:rFonts w:ascii="Arial" w:eastAsia="Times New Roman" w:hAnsi="Arial" w:cs="Arial"/>
+                <w:kern w:val="0"/>
+                <w:sz w:val="20"/>
+                <w:szCs w:val="20"/>
+                <w14:ligatures w14:val="none"/>
+              </w:rPr>
+              <w:t>Emisi</w:t>
+            </w:r>
+            <w:proofErr w:type="spellEnd"/>
           </w:p>
         </w:tc>
         <w:tc>
@@ -6077,16 +7915,62 @@
                 <w14:ligatures w14:val="none"/>
               </w:rPr>
             </w:pPr>
-            <w:r>
-              <w:rPr>
-                <w:rFonts w:ascii="Arial" w:eastAsia="Times New Roman" w:hAnsi="Arial" w:cs="Arial"/>
-                <w:kern w:val="0"/>
-                <w:sz w:val="20"/>
-                <w:szCs w:val="20"/>
-                <w14:ligatures w14:val="none"/>
-              </w:rPr>
-              <w:t>Pemenuhan Persetujuan Teknis Andalalin</w:t>
-            </w:r>
+            <w:proofErr w:type="spellStart"/>
+            <w:r>
+              <w:rPr>
+                <w:rFonts w:ascii="Arial" w:eastAsia="Times New Roman" w:hAnsi="Arial" w:cs="Arial"/>
+                <w:kern w:val="0"/>
+                <w:sz w:val="20"/>
+                <w:szCs w:val="20"/>
+                <w14:ligatures w14:val="none"/>
+              </w:rPr>
+              <w:t>Pemenuhan</w:t>
+            </w:r>
+            <w:proofErr w:type="spellEnd"/>
+            <w:r>
+              <w:rPr>
+                <w:rFonts w:ascii="Arial" w:eastAsia="Times New Roman" w:hAnsi="Arial" w:cs="Arial"/>
+                <w:kern w:val="0"/>
+                <w:sz w:val="20"/>
+                <w:szCs w:val="20"/>
+                <w14:ligatures w14:val="none"/>
+              </w:rPr>
+              <w:t xml:space="preserve"> </w:t>
+            </w:r>
+            <w:proofErr w:type="spellStart"/>
+            <w:r>
+              <w:rPr>
+                <w:rFonts w:ascii="Arial" w:eastAsia="Times New Roman" w:hAnsi="Arial" w:cs="Arial"/>
+                <w:kern w:val="0"/>
+                <w:sz w:val="20"/>
+                <w:szCs w:val="20"/>
+                <w14:ligatures w14:val="none"/>
+              </w:rPr>
+              <w:t>Persetujuan</w:t>
+            </w:r>
+            <w:proofErr w:type="spellEnd"/>
+            <w:r>
+              <w:rPr>
+                <w:rFonts w:ascii="Arial" w:eastAsia="Times New Roman" w:hAnsi="Arial" w:cs="Arial"/>
+                <w:kern w:val="0"/>
+                <w:sz w:val="20"/>
+                <w:szCs w:val="20"/>
+                <w14:ligatures w14:val="none"/>
+              </w:rPr>
+              <w:t xml:space="preserve"> Teknis </w:t>
+            </w:r>
+            <w:proofErr w:type="spellStart"/>
+            <w:r>
+              <w:rPr>
+                <w:rFonts w:ascii="Arial" w:eastAsia="Times New Roman" w:hAnsi="Arial" w:cs="Arial"/>
+                <w:kern w:val="0"/>
+                <w:sz w:val="20"/>
+                <w:szCs w:val="20"/>
+                <w14:ligatures w14:val="none"/>
+              </w:rPr>
+              <w:t>Andalalin</w:t>
+            </w:r>
+            <w:proofErr w:type="spellEnd"/>
           </w:p>
         </w:tc>
         <w:tc>
@@ -6355,7 +8239,227 @@
                 <w:szCs w:val="20"/>
                 <w14:ligatures w14:val="none"/>
               </w:rPr>
-              <w:t>Hasil Penapisan Kewajiban Pemenuhan Persetujuan Teknis (Dilampirkan Surat Keterangan Wajib / Tidak Wajib Persetujuan Teknis)</w:t>
+              <w:t xml:space="preserve">Hasil </w:t>
+            </w:r>
+            <w:proofErr w:type="spellStart"/>
+            <w:r>
+              <w:rPr>
+                <w:rFonts w:ascii="Arial" w:eastAsia="Times New Roman" w:hAnsi="Arial" w:cs="Arial"/>
+                <w:kern w:val="0"/>
+                <w:sz w:val="20"/>
+                <w:szCs w:val="20"/>
+                <w14:ligatures w14:val="none"/>
+              </w:rPr>
+              <w:t>Penapisan</w:t>
+            </w:r>
+            <w:proofErr w:type="spellEnd"/>
+            <w:r>
+              <w:rPr>
+                <w:rFonts w:ascii="Arial" w:eastAsia="Times New Roman" w:hAnsi="Arial" w:cs="Arial"/>
+                <w:kern w:val="0"/>
+                <w:sz w:val="20"/>
+                <w:szCs w:val="20"/>
+                <w14:ligatures w14:val="none"/>
+              </w:rPr>
+              <w:t xml:space="preserve"> </w:t>
+            </w:r>
+            <w:proofErr w:type="spellStart"/>
+            <w:r>
+              <w:rPr>
+                <w:rFonts w:ascii="Arial" w:eastAsia="Times New Roman" w:hAnsi="Arial" w:cs="Arial"/>
+                <w:kern w:val="0"/>
+                <w:sz w:val="20"/>
+                <w:szCs w:val="20"/>
+                <w14:ligatures w14:val="none"/>
+              </w:rPr>
+              <w:t>Kewajiban</w:t>
+            </w:r>
+            <w:proofErr w:type="spellEnd"/>
+            <w:r>
+              <w:rPr>
+                <w:rFonts w:ascii="Arial" w:eastAsia="Times New Roman" w:hAnsi="Arial" w:cs="Arial"/>
+                <w:kern w:val="0"/>
+                <w:sz w:val="20"/>
+                <w:szCs w:val="20"/>
+                <w14:ligatures w14:val="none"/>
+              </w:rPr>
+              <w:t xml:space="preserve"> </w:t>
+            </w:r>
+            <w:proofErr w:type="spellStart"/>
+            <w:r>
+              <w:rPr>
+                <w:rFonts w:ascii="Arial" w:eastAsia="Times New Roman" w:hAnsi="Arial" w:cs="Arial"/>
+                <w:kern w:val="0"/>
+                <w:sz w:val="20"/>
+                <w:szCs w:val="20"/>
+                <w14:ligatures w14:val="none"/>
+              </w:rPr>
+              <w:t>Pemenuhan</w:t>
+            </w:r>
+            <w:proofErr w:type="spellEnd"/>
+            <w:r>
+              <w:rPr>
+                <w:rFonts w:ascii="Arial" w:eastAsia="Times New Roman" w:hAnsi="Arial" w:cs="Arial"/>
+                <w:kern w:val="0"/>
+                <w:sz w:val="20"/>
+                <w:szCs w:val="20"/>
+                <w14:ligatures w14:val="none"/>
+              </w:rPr>
+              <w:t xml:space="preserve"> </w:t>
+            </w:r>
+            <w:proofErr w:type="spellStart"/>
+            <w:r>
+              <w:rPr>
+                <w:rFonts w:ascii="Arial" w:eastAsia="Times New Roman" w:hAnsi="Arial" w:cs="Arial"/>
+                <w:kern w:val="0"/>
+                <w:sz w:val="20"/>
+                <w:szCs w:val="20"/>
+                <w14:ligatures w14:val="none"/>
+              </w:rPr>
+              <w:t>Persetujuan</w:t>
+            </w:r>
+            <w:proofErr w:type="spellEnd"/>
+            <w:r>
+              <w:rPr>
+                <w:rFonts w:ascii="Arial" w:eastAsia="Times New Roman" w:hAnsi="Arial" w:cs="Arial"/>
+                <w:kern w:val="0"/>
+                <w:sz w:val="20"/>
+                <w:szCs w:val="20"/>
+                <w14:ligatures w14:val="none"/>
+              </w:rPr>
+              <w:t xml:space="preserve"> Teknis (</w:t>
+            </w:r>
+            <w:proofErr w:type="spellStart"/>
+            <w:r>
+              <w:rPr>
+                <w:rFonts w:ascii="Arial" w:eastAsia="Times New Roman" w:hAnsi="Arial" w:cs="Arial"/>
+                <w:kern w:val="0"/>
+                <w:sz w:val="20"/>
+                <w:szCs w:val="20"/>
+                <w14:ligatures w14:val="none"/>
+              </w:rPr>
+              <w:t>Dilampirkan</w:t>
+            </w:r>
+            <w:proofErr w:type="spellEnd"/>
+            <w:r>
+              <w:rPr>
+                <w:rFonts w:ascii="Arial" w:eastAsia="Times New Roman" w:hAnsi="Arial" w:cs="Arial"/>
+                <w:kern w:val="0"/>
+                <w:sz w:val="20"/>
+                <w:szCs w:val="20"/>
+                <w14:ligatures w14:val="none"/>
+              </w:rPr>
+              <w:t xml:space="preserve"> Surat </w:t>
+            </w:r>
+            <w:proofErr w:type="spellStart"/>
+            <w:r>
+              <w:rPr>
+                <w:rFonts w:ascii="Arial" w:eastAsia="Times New Roman" w:hAnsi="Arial" w:cs="Arial"/>
+                <w:kern w:val="0"/>
+                <w:sz w:val="20"/>
+                <w:szCs w:val="20"/>
+                <w14:ligatures w14:val="none"/>
+              </w:rPr>
+              <w:t>Keterangan</w:t>
+            </w:r>
+            <w:proofErr w:type="spellEnd"/>
+            <w:r>
+              <w:rPr>
+                <w:rFonts w:ascii="Arial" w:eastAsia="Times New Roman" w:hAnsi="Arial" w:cs="Arial"/>
+                <w:kern w:val="0"/>
+                <w:sz w:val="20"/>
+                <w:szCs w:val="20"/>
+                <w14:ligatures w14:val="none"/>
+              </w:rPr>
+              <w:t xml:space="preserve"> </w:t>
+            </w:r>
+            <w:proofErr w:type="spellStart"/>
+            <w:r>
+              <w:rPr>
+                <w:rFonts w:ascii="Arial" w:eastAsia="Times New Roman" w:hAnsi="Arial" w:cs="Arial"/>
+                <w:kern w:val="0"/>
+                <w:sz w:val="20"/>
+                <w:szCs w:val="20"/>
+                <w14:ligatures w14:val="none"/>
+              </w:rPr>
+              <w:t>Wajib</w:t>
+            </w:r>
+            <w:proofErr w:type="spellEnd"/>
+            <w:r>
+              <w:rPr>
+                <w:rFonts w:ascii="Arial" w:eastAsia="Times New Roman" w:hAnsi="Arial" w:cs="Arial"/>
+                <w:kern w:val="0"/>
+                <w:sz w:val="20"/>
+                <w:szCs w:val="20"/>
+                <w14:ligatures w14:val="none"/>
+              </w:rPr>
+              <w:t xml:space="preserve"> / </w:t>
+            </w:r>
+            <w:proofErr w:type="spellStart"/>
+            <w:r>
+              <w:rPr>
+                <w:rFonts w:ascii="Arial" w:eastAsia="Times New Roman" w:hAnsi="Arial" w:cs="Arial"/>
+                <w:kern w:val="0"/>
+                <w:sz w:val="20"/>
+                <w:szCs w:val="20"/>
+                <w14:ligatures w14:val="none"/>
+              </w:rPr>
+              <w:t>Tidak</w:t>
+            </w:r>
+            <w:proofErr w:type="spellEnd"/>
+            <w:r>
+              <w:rPr>
+                <w:rFonts w:ascii="Arial" w:eastAsia="Times New Roman" w:hAnsi="Arial" w:cs="Arial"/>
+                <w:kern w:val="0"/>
+                <w:sz w:val="20"/>
+                <w:szCs w:val="20"/>
+                <w14:ligatures w14:val="none"/>
+              </w:rPr>
+              <w:t xml:space="preserve"> </w:t>
+            </w:r>
+            <w:proofErr w:type="spellStart"/>
+            <w:r>
+              <w:rPr>
+                <w:rFonts w:ascii="Arial" w:eastAsia="Times New Roman" w:hAnsi="Arial" w:cs="Arial"/>
+                <w:kern w:val="0"/>
+                <w:sz w:val="20"/>
+                <w:szCs w:val="20"/>
+                <w14:ligatures w14:val="none"/>
+              </w:rPr>
+              <w:t>Wajib</w:t>
+            </w:r>
+            <w:proofErr w:type="spellEnd"/>
+            <w:r>
+              <w:rPr>
+                <w:rFonts w:ascii="Arial" w:eastAsia="Times New Roman" w:hAnsi="Arial" w:cs="Arial"/>
+                <w:kern w:val="0"/>
+                <w:sz w:val="20"/>
+                <w:szCs w:val="20"/>
+                <w14:ligatures w14:val="none"/>
+              </w:rPr>
+              <w:t xml:space="preserve"> </w:t>
+            </w:r>
+            <w:proofErr w:type="spellStart"/>
+            <w:r>
+              <w:rPr>
+                <w:rFonts w:ascii="Arial" w:eastAsia="Times New Roman" w:hAnsi="Arial" w:cs="Arial"/>
+                <w:kern w:val="0"/>
+                <w:sz w:val="20"/>
+                <w:szCs w:val="20"/>
+                <w14:ligatures w14:val="none"/>
+              </w:rPr>
+              <w:t>Persetujuan</w:t>
+            </w:r>
+            <w:proofErr w:type="spellEnd"/>
+            <w:r>
+              <w:rPr>
+                <w:rFonts w:ascii="Arial" w:eastAsia="Times New Roman" w:hAnsi="Arial" w:cs="Arial"/>
+                <w:kern w:val="0"/>
+                <w:sz w:val="20"/>
+                <w:szCs w:val="20"/>
+                <w14:ligatures w14:val="none"/>
+              </w:rPr>
+              <w:t xml:space="preserve"> Teknis)</w:t>
             </w:r>
           </w:p>
         </w:tc>
@@ -6614,7 +8718,51 @@
                 <w:szCs w:val="20"/>
                 <w14:ligatures w14:val="none"/>
               </w:rPr>
-              <w:t>Bukti Upload Permohonan pada AMDALNET dan/Atau SIDARLING</w:t>
+              <w:t xml:space="preserve">Bukti Upload </w:t>
+            </w:r>
+            <w:proofErr w:type="spellStart"/>
+            <w:r>
+              <w:rPr>
+                <w:rFonts w:ascii="Arial" w:eastAsia="Times New Roman" w:hAnsi="Arial" w:cs="Arial"/>
+                <w:kern w:val="0"/>
+                <w:sz w:val="20"/>
+                <w:szCs w:val="20"/>
+                <w14:ligatures w14:val="none"/>
+              </w:rPr>
+              <w:t>Permohonan</w:t>
+            </w:r>
+            <w:proofErr w:type="spellEnd"/>
+            <w:r>
+              <w:rPr>
+                <w:rFonts w:ascii="Arial" w:eastAsia="Times New Roman" w:hAnsi="Arial" w:cs="Arial"/>
+                <w:kern w:val="0"/>
+                <w:sz w:val="20"/>
+                <w:szCs w:val="20"/>
+                <w14:ligatures w14:val="none"/>
+              </w:rPr>
+              <w:t xml:space="preserve"> pada AMDALNET dan/</w:t>
+            </w:r>
+            <w:proofErr w:type="spellStart"/>
+            <w:r>
+              <w:rPr>
+                <w:rFonts w:ascii="Arial" w:eastAsia="Times New Roman" w:hAnsi="Arial" w:cs="Arial"/>
+                <w:kern w:val="0"/>
+                <w:sz w:val="20"/>
+                <w:szCs w:val="20"/>
+                <w14:ligatures w14:val="none"/>
+              </w:rPr>
+              <w:t>Atau</w:t>
+            </w:r>
+            <w:proofErr w:type="spellEnd"/>
+            <w:r>
+              <w:rPr>
+                <w:rFonts w:ascii="Arial" w:eastAsia="Times New Roman" w:hAnsi="Arial" w:cs="Arial"/>
+                <w:kern w:val="0"/>
+                <w:sz w:val="20"/>
+                <w:szCs w:val="20"/>
+                <w14:ligatures w14:val="none"/>
+              </w:rPr>
+              <w:t xml:space="preserve"> SIDARLING</w:t>
             </w:r>
           </w:p>
         </w:tc>
@@ -7051,7 +9199,43 @@
                 <w:sz w:val="24"/>
                 <w:szCs w:val="24"/>
               </w:rPr>
-              <w:t xml:space="preserve">Hasil Verifikasi Uji Administrasi </w:t>
+              <w:t xml:space="preserve">Hasil </w:t>
+            </w:r>
+            <w:proofErr w:type="spellStart"/>
+            <w:r>
+              <w:rPr>
+                <w:rFonts w:ascii="Arial" w:hAnsi="Arial" w:cs="Arial"/>
+                <w:sz w:val="24"/>
+                <w:szCs w:val="24"/>
+              </w:rPr>
+              <w:t>Verifikasi</w:t>
+            </w:r>
+            <w:proofErr w:type="spellEnd"/>
+            <w:r>
+              <w:rPr>
+                <w:rFonts w:ascii="Arial" w:hAnsi="Arial" w:cs="Arial"/>
+                <w:sz w:val="24"/>
+                <w:szCs w:val="24"/>
+              </w:rPr>
+              <w:t xml:space="preserve"> Uji </w:t>
+            </w:r>
+            <w:proofErr w:type="spellStart"/>
+            <w:r>
+              <w:rPr>
+                <w:rFonts w:ascii="Arial" w:hAnsi="Arial" w:cs="Arial"/>
+                <w:sz w:val="24"/>
+                <w:szCs w:val="24"/>
+              </w:rPr>
+              <w:t>Administrasi</w:t>
+            </w:r>
+            <w:proofErr w:type="spellEnd"/>
+            <w:r>
+              <w:rPr>
+                <w:rFonts w:ascii="Arial" w:hAnsi="Arial" w:cs="Arial"/>
+                <w:sz w:val="24"/>
+                <w:szCs w:val="24"/>
+              </w:rPr>
+              <w:t xml:space="preserve"> </w:t>
             </w:r>
           </w:p>
         </w:tc>
@@ -7095,7 +9279,25 @@
                 <w:sz w:val="24"/>
                 <w:szCs w:val="24"/>
               </w:rPr>
-              <w:t>{hasil_verifikasi_uji}</w:t>
+              <w:t>{</w:t>
+            </w:r>
+            <w:proofErr w:type="spellStart"/>
+            <w:r>
+              <w:rPr>
+                <w:rFonts w:ascii="Arial" w:hAnsi="Arial" w:cs="Arial"/>
+                <w:sz w:val="24"/>
+                <w:szCs w:val="24"/>
+              </w:rPr>
+              <w:t>hasil_verifikasi_uji</w:t>
+            </w:r>
+            <w:proofErr w:type="spellEnd"/>
+            <w:r>
+              <w:rPr>
+                <w:rFonts w:ascii="Arial" w:hAnsi="Arial" w:cs="Arial"/>
+                <w:sz w:val="24"/>
+                <w:szCs w:val="24"/>
+              </w:rPr>
+              <w:t>}</w:t>
             </w:r>
           </w:p>
         </w:tc>
@@ -7117,14 +9319,88 @@
                 <w:szCs w:val="24"/>
               </w:rPr>
             </w:pPr>
-            <w:r>
-              <w:rPr>
-                <w:rFonts w:ascii="Arial" w:hAnsi="Arial" w:cs="Arial"/>
-                <w:sz w:val="24"/>
-                <w:szCs w:val="24"/>
-              </w:rPr>
-              <w:t>Catatan untuk pemrakarsa atau Konsultan</w:t>
-            </w:r>
+            <w:proofErr w:type="spellStart"/>
+            <w:r>
+              <w:rPr>
+                <w:rFonts w:ascii="Arial" w:hAnsi="Arial" w:cs="Arial"/>
+                <w:sz w:val="24"/>
+                <w:szCs w:val="24"/>
+              </w:rPr>
+              <w:t>Catatan</w:t>
+            </w:r>
+            <w:proofErr w:type="spellEnd"/>
+            <w:r>
+              <w:rPr>
+                <w:rFonts w:ascii="Arial" w:hAnsi="Arial" w:cs="Arial"/>
+                <w:sz w:val="24"/>
+                <w:szCs w:val="24"/>
+              </w:rPr>
+              <w:t xml:space="preserve"> </w:t>
+            </w:r>
+            <w:proofErr w:type="spellStart"/>
+            <w:r>
+              <w:rPr>
+                <w:rFonts w:ascii="Arial" w:hAnsi="Arial" w:cs="Arial"/>
+                <w:sz w:val="24"/>
+                <w:szCs w:val="24"/>
+              </w:rPr>
+              <w:t>untuk</w:t>
+            </w:r>
+            <w:proofErr w:type="spellEnd"/>
+            <w:r>
+              <w:rPr>
+                <w:rFonts w:ascii="Arial" w:hAnsi="Arial" w:cs="Arial"/>
+                <w:sz w:val="24"/>
+                <w:szCs w:val="24"/>
+              </w:rPr>
+              <w:t xml:space="preserve"> </w:t>
+            </w:r>
+            <w:proofErr w:type="spellStart"/>
+            <w:r>
+              <w:rPr>
+                <w:rFonts w:ascii="Arial" w:hAnsi="Arial" w:cs="Arial"/>
+                <w:sz w:val="24"/>
+                <w:szCs w:val="24"/>
+              </w:rPr>
+              <w:t>pemrakarsa</w:t>
+            </w:r>
+            <w:proofErr w:type="spellEnd"/>
+            <w:r>
+              <w:rPr>
+                <w:rFonts w:ascii="Arial" w:hAnsi="Arial" w:cs="Arial"/>
+                <w:sz w:val="24"/>
+                <w:szCs w:val="24"/>
+              </w:rPr>
+              <w:t xml:space="preserve"> </w:t>
+            </w:r>
+            <w:proofErr w:type="spellStart"/>
+            <w:r>
+              <w:rPr>
+                <w:rFonts w:ascii="Arial" w:hAnsi="Arial" w:cs="Arial"/>
+                <w:sz w:val="24"/>
+                <w:szCs w:val="24"/>
+              </w:rPr>
+              <w:t>atau</w:t>
+            </w:r>
+            <w:proofErr w:type="spellEnd"/>
+            <w:r>
+              <w:rPr>
+                <w:rFonts w:ascii="Arial" w:hAnsi="Arial" w:cs="Arial"/>
+                <w:sz w:val="24"/>
+                <w:szCs w:val="24"/>
+              </w:rPr>
+              <w:t xml:space="preserve"> </w:t>
+            </w:r>
+            <w:proofErr w:type="spellStart"/>
+            <w:r>
+              <w:rPr>
+                <w:rFonts w:ascii="Arial" w:hAnsi="Arial" w:cs="Arial"/>
+                <w:sz w:val="24"/>
+                <w:szCs w:val="24"/>
+              </w:rPr>
+              <w:t>Konsultan</w:t>
+            </w:r>
+            <w:proofErr w:type="spellEnd"/>
           </w:p>
         </w:tc>
         <w:tc>
@@ -7167,7 +9443,25 @@
                 <w:sz w:val="24"/>
                 <w:szCs w:val="24"/>
               </w:rPr>
-              <w:t>{keterangan}</w:t>
+              <w:t>{</w:t>
+            </w:r>
+            <w:proofErr w:type="spellStart"/>
+            <w:r>
+              <w:rPr>
+                <w:rFonts w:ascii="Arial" w:hAnsi="Arial" w:cs="Arial"/>
+                <w:sz w:val="24"/>
+                <w:szCs w:val="24"/>
+              </w:rPr>
+              <w:t>keterangan</w:t>
+            </w:r>
+            <w:proofErr w:type="spellEnd"/>
+            <w:r>
+              <w:rPr>
+                <w:rFonts w:ascii="Arial" w:hAnsi="Arial" w:cs="Arial"/>
+                <w:sz w:val="24"/>
+                <w:szCs w:val="24"/>
+              </w:rPr>
+              <w:t>}</w:t>
             </w:r>
           </w:p>
         </w:tc>
@@ -7194,14 +9488,61 @@
           <w:szCs w:val="24"/>
         </w:rPr>
       </w:pPr>
+      <w:proofErr w:type="spellStart"/>
       <w:r>
         <w:rPr>
           <w:rFonts w:ascii="Arial" w:hAnsi="Arial" w:cs="Arial"/>
           <w:sz w:val="24"/>
           <w:szCs w:val="24"/>
         </w:rPr>
-        <w:t xml:space="preserve">Demikian hasil pemeriksaan </w:t>
+        <w:t>Demikian</w:t>
       </w:r>
+      <w:proofErr w:type="spellEnd"/>
+      <w:r>
+        <w:rPr>
+          <w:rFonts w:ascii="Arial" w:hAnsi="Arial" w:cs="Arial"/>
+          <w:sz w:val="24"/>
+          <w:szCs w:val="24"/>
+        </w:rPr>
+        <w:t xml:space="preserve"> </w:t>
+      </w:r>
+      <w:proofErr w:type="spellStart"/>
+      <w:r>
+        <w:rPr>
+          <w:rFonts w:ascii="Arial" w:hAnsi="Arial" w:cs="Arial"/>
+          <w:sz w:val="24"/>
+          <w:szCs w:val="24"/>
+        </w:rPr>
+        <w:t>hasil</w:t>
+      </w:r>
+      <w:proofErr w:type="spellEnd"/>
+      <w:r>
+        <w:rPr>
+          <w:rFonts w:ascii="Arial" w:hAnsi="Arial" w:cs="Arial"/>
+          <w:sz w:val="24"/>
+          <w:szCs w:val="24"/>
+        </w:rPr>
+        <w:t xml:space="preserve"> </w:t>
+      </w:r>
+      <w:proofErr w:type="spellStart"/>
+      <w:r>
+        <w:rPr>
+          <w:rFonts w:ascii="Arial" w:hAnsi="Arial" w:cs="Arial"/>
+          <w:sz w:val="24"/>
+          <w:szCs w:val="24"/>
+        </w:rPr>
+        <w:t>pemeriksaan</w:t>
+      </w:r>
+      <w:proofErr w:type="spellEnd"/>
+      <w:r>
+        <w:rPr>
+          <w:rFonts w:ascii="Arial" w:hAnsi="Arial" w:cs="Arial"/>
+          <w:sz w:val="24"/>
+          <w:szCs w:val="24"/>
+        </w:rPr>
+        <w:t xml:space="preserve"> </w:t>
+      </w:r>
+      <w:proofErr w:type="spellStart"/>
       <w:r>
         <w:rPr>
           <w:rFonts w:ascii="Arial" w:hAnsi="Arial" w:cs="Arial"/>
@@ -7216,7 +9557,115 @@
           <w:sz w:val="24"/>
           <w:szCs w:val="24"/>
         </w:rPr>
-        <w:t>dministrasi Dokumen Lingkungan ini selanjutnya agar dapat d</w:t>
+        <w:t>dministrasi</w:t>
+      </w:r>
+      <w:proofErr w:type="spellEnd"/>
+      <w:r>
+        <w:rPr>
+          <w:rFonts w:ascii="Arial" w:hAnsi="Arial" w:cs="Arial"/>
+          <w:sz w:val="24"/>
+          <w:szCs w:val="24"/>
+        </w:rPr>
+        <w:t xml:space="preserve"> </w:t>
+      </w:r>
+      <w:proofErr w:type="spellStart"/>
+      <w:r>
+        <w:rPr>
+          <w:rFonts w:ascii="Arial" w:hAnsi="Arial" w:cs="Arial"/>
+          <w:sz w:val="24"/>
+          <w:szCs w:val="24"/>
+        </w:rPr>
+        <w:t>Dokumen</w:t>
+      </w:r>
+      <w:proofErr w:type="spellEnd"/>
+      <w:r>
+        <w:rPr>
+          <w:rFonts w:ascii="Arial" w:hAnsi="Arial" w:cs="Arial"/>
+          <w:sz w:val="24"/>
+          <w:szCs w:val="24"/>
+        </w:rPr>
+        <w:t xml:space="preserve"> </w:t>
+      </w:r>
+      <w:proofErr w:type="spellStart"/>
+      <w:r>
+        <w:rPr>
+          <w:rFonts w:ascii="Arial" w:hAnsi="Arial" w:cs="Arial"/>
+          <w:sz w:val="24"/>
+          <w:szCs w:val="24"/>
+        </w:rPr>
+        <w:t>Lingkungan</w:t>
+      </w:r>
+      <w:proofErr w:type="spellEnd"/>
+      <w:r>
+        <w:rPr>
+          <w:rFonts w:ascii="Arial" w:hAnsi="Arial" w:cs="Arial"/>
+          <w:sz w:val="24"/>
+          <w:szCs w:val="24"/>
+        </w:rPr>
+        <w:t xml:space="preserve"> </w:t>
+      </w:r>
+      <w:proofErr w:type="spellStart"/>
+      <w:r>
+        <w:rPr>
+          <w:rFonts w:ascii="Arial" w:hAnsi="Arial" w:cs="Arial"/>
+          <w:sz w:val="24"/>
+          <w:szCs w:val="24"/>
+        </w:rPr>
+        <w:t>ini</w:t>
+      </w:r>
+      <w:proofErr w:type="spellEnd"/>
+      <w:r>
+        <w:rPr>
+          <w:rFonts w:ascii="Arial" w:hAnsi="Arial" w:cs="Arial"/>
+          <w:sz w:val="24"/>
+          <w:szCs w:val="24"/>
+        </w:rPr>
+        <w:t xml:space="preserve"> </w:t>
+      </w:r>
+      <w:proofErr w:type="spellStart"/>
+      <w:r>
+        <w:rPr>
+          <w:rFonts w:ascii="Arial" w:hAnsi="Arial" w:cs="Arial"/>
+          <w:sz w:val="24"/>
+          <w:szCs w:val="24"/>
+        </w:rPr>
+        <w:t>selanjutnya</w:t>
+      </w:r>
+      <w:proofErr w:type="spellEnd"/>
+      <w:r>
+        <w:rPr>
+          <w:rFonts w:ascii="Arial" w:hAnsi="Arial" w:cs="Arial"/>
+          <w:sz w:val="24"/>
+          <w:szCs w:val="24"/>
+        </w:rPr>
+        <w:t xml:space="preserve"> agar </w:t>
+      </w:r>
+      <w:proofErr w:type="spellStart"/>
+      <w:r>
+        <w:rPr>
+          <w:rFonts w:ascii="Arial" w:hAnsi="Arial" w:cs="Arial"/>
+          <w:sz w:val="24"/>
+          <w:szCs w:val="24"/>
+        </w:rPr>
+        <w:t>dapat</w:t>
+      </w:r>
+      <w:proofErr w:type="spellEnd"/>
+      <w:r>
+        <w:rPr>
+          <w:rFonts w:ascii="Arial" w:hAnsi="Arial" w:cs="Arial"/>
+          <w:sz w:val="24"/>
+          <w:szCs w:val="24"/>
+        </w:rPr>
+        <w:t xml:space="preserve"> </w:t>
+      </w:r>
+      <w:proofErr w:type="spellStart"/>
+      <w:r>
+        <w:rPr>
+          <w:rFonts w:ascii="Arial" w:hAnsi="Arial" w:cs="Arial"/>
+          <w:sz w:val="24"/>
+          <w:szCs w:val="24"/>
+        </w:rPr>
+        <w:t>d</w:t>
       </w:r>
       <w:r>
         <w:rPr>
@@ -7224,8 +9673,45 @@
           <w:sz w:val="24"/>
           <w:szCs w:val="24"/>
         </w:rPr>
-        <w:t>iproses lebih lanjut</w:t>
+        <w:t>iproses</w:t>
       </w:r>
+      <w:proofErr w:type="spellEnd"/>
+      <w:r>
+        <w:rPr>
+          <w:rFonts w:ascii="Arial" w:hAnsi="Arial" w:cs="Arial"/>
+          <w:sz w:val="24"/>
+          <w:szCs w:val="24"/>
+        </w:rPr>
+        <w:t xml:space="preserve"> </w:t>
+      </w:r>
+      <w:proofErr w:type="spellStart"/>
+      <w:r>
+        <w:rPr>
+          <w:rFonts w:ascii="Arial" w:hAnsi="Arial" w:cs="Arial"/>
+          <w:sz w:val="24"/>
+          <w:szCs w:val="24"/>
+        </w:rPr>
+        <w:t>lebih</w:t>
+      </w:r>
+      <w:proofErr w:type="spellEnd"/>
+      <w:r>
+        <w:rPr>
+          <w:rFonts w:ascii="Arial" w:hAnsi="Arial" w:cs="Arial"/>
+          <w:sz w:val="24"/>
+          <w:szCs w:val="24"/>
+        </w:rPr>
+        <w:t xml:space="preserve"> </w:t>
+      </w:r>
+      <w:proofErr w:type="spellStart"/>
+      <w:r>
+        <w:rPr>
+          <w:rFonts w:ascii="Arial" w:hAnsi="Arial" w:cs="Arial"/>
+          <w:sz w:val="24"/>
+          <w:szCs w:val="24"/>
+        </w:rPr>
+        <w:t>lanjut</w:t>
+      </w:r>
+      <w:proofErr w:type="spellEnd"/>
     </w:p>
     <w:tbl>
       <w:tblPr>
@@ -7270,13 +9756,61 @@
                 <w:szCs w:val="24"/>
               </w:rPr>
             </w:pPr>
-            <w:r>
-              <w:rPr>
-                <w:rFonts w:ascii="Arial" w:hAnsi="Arial" w:cs="Arial"/>
-                <w:sz w:val="24"/>
-                <w:szCs w:val="24"/>
-              </w:rPr>
-              <w:t>Sragen, {hari_ini_tanggal},{hari_ini_bulan}</w:t>
+            <w:proofErr w:type="spellStart"/>
+            <w:r>
+              <w:rPr>
+                <w:rFonts w:ascii="Arial" w:hAnsi="Arial" w:cs="Arial"/>
+                <w:sz w:val="24"/>
+                <w:szCs w:val="24"/>
+              </w:rPr>
+              <w:t>Sragen</w:t>
+            </w:r>
+            <w:proofErr w:type="spellEnd"/>
+            <w:r>
+              <w:rPr>
+                <w:rFonts w:ascii="Arial" w:hAnsi="Arial" w:cs="Arial"/>
+                <w:sz w:val="24"/>
+                <w:szCs w:val="24"/>
+              </w:rPr>
+              <w:t>, {</w:t>
+            </w:r>
+            <w:proofErr w:type="spellStart"/>
+            <w:r>
+              <w:rPr>
+                <w:rFonts w:ascii="Arial" w:hAnsi="Arial" w:cs="Arial"/>
+                <w:sz w:val="24"/>
+                <w:szCs w:val="24"/>
+              </w:rPr>
+              <w:t>hari_ini_tanggal</w:t>
+            </w:r>
+            <w:proofErr w:type="spellEnd"/>
+            <w:proofErr w:type="gramStart"/>
+            <w:r>
+              <w:rPr>
+                <w:rFonts w:ascii="Arial" w:hAnsi="Arial" w:cs="Arial"/>
+                <w:sz w:val="24"/>
+                <w:szCs w:val="24"/>
+              </w:rPr>
+              <w:t>},{</w:t>
+            </w:r>
+            <w:proofErr w:type="spellStart"/>
+            <w:proofErr w:type="gramEnd"/>
+            <w:r>
+              <w:rPr>
+                <w:rFonts w:ascii="Arial" w:hAnsi="Arial" w:cs="Arial"/>
+                <w:sz w:val="24"/>
+                <w:szCs w:val="24"/>
+              </w:rPr>
+              <w:t>hari_ini_bulan</w:t>
+            </w:r>
+            <w:proofErr w:type="spellEnd"/>
+            <w:r>
+              <w:rPr>
+                <w:rFonts w:ascii="Arial" w:hAnsi="Arial" w:cs="Arial"/>
+                <w:sz w:val="24"/>
+                <w:szCs w:val="24"/>
+              </w:rPr>
+              <w:t>}</w:t>
             </w:r>
             <w:r>
               <w:rPr>
@@ -7292,7 +9826,25 @@
                 <w:sz w:val="24"/>
                 <w:szCs w:val="24"/>
               </w:rPr>
-              <w:t>{hari_ini_tahun}</w:t>
+              <w:t>{</w:t>
+            </w:r>
+            <w:proofErr w:type="spellStart"/>
+            <w:r>
+              <w:rPr>
+                <w:rFonts w:ascii="Arial" w:hAnsi="Arial" w:cs="Arial"/>
+                <w:sz w:val="24"/>
+                <w:szCs w:val="24"/>
+              </w:rPr>
+              <w:t>hari_ini_tahun</w:t>
+            </w:r>
+            <w:proofErr w:type="spellEnd"/>
+            <w:r>
+              <w:rPr>
+                <w:rFonts w:ascii="Arial" w:hAnsi="Arial" w:cs="Arial"/>
+                <w:sz w:val="24"/>
+                <w:szCs w:val="24"/>
+              </w:rPr>
+              <w:t>}</w:t>
             </w:r>
           </w:p>
           <w:p>
@@ -7311,8 +9863,28 @@
                 <w:sz w:val="24"/>
                 <w:szCs w:val="24"/>
               </w:rPr>
-              <w:t>Tim Uji Administrasi :</w:t>
-            </w:r>
+              <w:t xml:space="preserve">Tim Uji </w:t>
+            </w:r>
+            <w:proofErr w:type="spellStart"/>
+            <w:proofErr w:type="gramStart"/>
+            <w:r>
+              <w:rPr>
+                <w:rFonts w:ascii="Arial" w:hAnsi="Arial" w:cs="Arial"/>
+                <w:sz w:val="24"/>
+                <w:szCs w:val="24"/>
+              </w:rPr>
+              <w:t>Administrasi</w:t>
+            </w:r>
+            <w:proofErr w:type="spellEnd"/>
+            <w:r>
+              <w:rPr>
+                <w:rFonts w:ascii="Arial" w:hAnsi="Arial" w:cs="Arial"/>
+                <w:sz w:val="24"/>
+                <w:szCs w:val="24"/>
+              </w:rPr>
+              <w:t xml:space="preserve"> :</w:t>
+            </w:r>
+            <w:proofErr w:type="gramEnd"/>
           </w:p>
         </w:tc>
       </w:tr>
@@ -7340,7 +9912,25 @@
                 <w:sz w:val="24"/>
                 <w:szCs w:val="24"/>
               </w:rPr>
-              <w:t>{#tim_penilai_anggota}{nomor_urut}.</w:t>
+              <w:t>{#tim_penilai_</w:t>
+            </w:r>
+            <w:proofErr w:type="gramStart"/>
+            <w:r>
+              <w:rPr>
+                <w:rFonts w:ascii="Arial" w:hAnsi="Arial" w:cs="Arial"/>
+                <w:sz w:val="24"/>
+                <w:szCs w:val="24"/>
+              </w:rPr>
+              <w:t>anggota}{</w:t>
+            </w:r>
+            <w:proofErr w:type="gramEnd"/>
+            <w:r>
+              <w:rPr>
+                <w:rFonts w:ascii="Arial" w:hAnsi="Arial" w:cs="Arial"/>
+                <w:sz w:val="24"/>
+                <w:szCs w:val="24"/>
+              </w:rPr>
+              <w:t>nomor_urut}.</w:t>
             </w:r>
           </w:p>
         </w:tc>
@@ -7365,13 +9955,23 @@
               </w:rPr>
               <w:t>{</w:t>
             </w:r>
-            <w:r>
-              <w:rPr>
-                <w:rFonts w:ascii="Arial" w:hAnsi="Arial" w:cs="Arial"/>
-                <w:sz w:val="24"/>
-                <w:szCs w:val="24"/>
-              </w:rPr>
-              <w:t>nama}</w:t>
+            <w:proofErr w:type="spellStart"/>
+            <w:r>
+              <w:rPr>
+                <w:rFonts w:ascii="Arial" w:hAnsi="Arial" w:cs="Arial"/>
+                <w:sz w:val="24"/>
+                <w:szCs w:val="24"/>
+              </w:rPr>
+              <w:t>nama</w:t>
+            </w:r>
+            <w:proofErr w:type="spellEnd"/>
+            <w:r>
+              <w:rPr>
+                <w:rFonts w:ascii="Arial" w:hAnsi="Arial" w:cs="Arial"/>
+                <w:sz w:val="24"/>
+                <w:szCs w:val="24"/>
+              </w:rPr>
+              <w:t>}</w:t>
             </w:r>
           </w:p>
         </w:tc>
@@ -7394,7 +9994,25 @@
                 <w:sz w:val="24"/>
                 <w:szCs w:val="24"/>
               </w:rPr>
-              <w:t>{nomor_urut}.</w:t>
+              <w:t>{</w:t>
+            </w:r>
+            <w:proofErr w:type="spellStart"/>
+            <w:r>
+              <w:rPr>
+                <w:rFonts w:ascii="Arial" w:hAnsi="Arial" w:cs="Arial"/>
+                <w:sz w:val="24"/>
+                <w:szCs w:val="24"/>
+              </w:rPr>
+              <w:t>nomor_urut</w:t>
+            </w:r>
+            <w:proofErr w:type="spellEnd"/>
+            <w:r>
+              <w:rPr>
+                <w:rFonts w:ascii="Arial" w:hAnsi="Arial" w:cs="Arial"/>
+                <w:sz w:val="24"/>
+                <w:szCs w:val="24"/>
+              </w:rPr>
+              <w:t>}.</w:t>
             </w:r>
             <w:r>
               <w:rPr>
@@ -7410,7 +10028,25 @@
                 <w:sz w:val="24"/>
                 <w:szCs w:val="24"/>
               </w:rPr>
-              <w:t>.........{/tim_penilai_anggota}</w:t>
+              <w:t>.........{/</w:t>
+            </w:r>
+            <w:proofErr w:type="spellStart"/>
+            <w:r>
+              <w:rPr>
+                <w:rFonts w:ascii="Arial" w:hAnsi="Arial" w:cs="Arial"/>
+                <w:sz w:val="24"/>
+                <w:szCs w:val="24"/>
+              </w:rPr>
+              <w:t>tim_penilai_anggota</w:t>
+            </w:r>
+            <w:proofErr w:type="spellEnd"/>
+            <w:r>
+              <w:rPr>
+                <w:rFonts w:ascii="Arial" w:hAnsi="Arial" w:cs="Arial"/>
+                <w:sz w:val="24"/>
+                <w:szCs w:val="24"/>
+              </w:rPr>
+              <w:t>}</w:t>
             </w:r>
           </w:p>
         </w:tc>

</xml_diff>